<commit_message>
ci: setup Azure Static Web Apps deployment pipeline
- Add Azure Static Web Apps workflow for CI/CD
- Configure YAML for build output (dist)
- Remove old deployment YAML
- Update .gitignore for development phase
- Fix Main.jsx reference in index.html
</commit_message>
<xml_diff>
--- a/Documentation/Personal Web Portfolio Documentation.docx
+++ b/Documentation/Personal Web Portfolio Documentation.docx
@@ -5,6 +5,7 @@
     <w:p>
       <w:pPr>
         <w:pStyle w:val="Ttulo"/>
+        <w:ind w:left="708" w:hanging="708"/>
         <w:rPr>
           <w:sz w:val="96"/>
           <w:szCs w:val="72"/>
@@ -236,7 +237,7 @@
           <w:lang w:val="en-US"/>
         </w:rPr>
         <w:drawing>
-          <wp:anchor distT="0" distB="0" distL="114300" distR="114300" simplePos="0" relativeHeight="251658240" behindDoc="0" locked="0" layoutInCell="1" allowOverlap="1" wp14:anchorId="69219F7A" wp14:editId="130528AA">
+          <wp:anchor distT="0" distB="0" distL="114300" distR="114300" simplePos="0" relativeHeight="251658240" behindDoc="0" locked="0" layoutInCell="1" allowOverlap="1" wp14:anchorId="69219F7A" wp14:editId="5A1E3975">
             <wp:simplePos x="0" y="0"/>
             <wp:positionH relativeFrom="margin">
               <wp:posOffset>771525</wp:posOffset>
@@ -357,11 +358,12 @@
         </w:rPr>
         <w:fldChar w:fldCharType="separate"/>
       </w:r>
-      <w:hyperlink w:anchor="_Toc230034538" w:history="1">
+      <w:hyperlink w:anchor="_Toc230097266" w:history="1">
         <w:r>
           <w:rPr>
             <w:rStyle w:val="Hipervnculo"/>
             <w:noProof/>
+            <w:lang w:val="en-US"/>
           </w:rPr>
           <w:t>Web development</w:t>
         </w:r>
@@ -384,7 +386,7 @@
             <w:noProof/>
             <w:webHidden/>
           </w:rPr>
-          <w:instrText xml:space="preserve"> PAGEREF _Toc230034538 \h </w:instrText>
+          <w:instrText xml:space="preserve"> PAGEREF _Toc230097266 \h </w:instrText>
         </w:r>
         <w:r>
           <w:rPr>
@@ -430,7 +432,7 @@
           <w:szCs w:val="24"/>
         </w:rPr>
       </w:pPr>
-      <w:hyperlink w:anchor="_Toc230034539" w:history="1">
+      <w:hyperlink w:anchor="_Toc230097267" w:history="1">
         <w:r>
           <w:rPr>
             <w:rStyle w:val="Hipervnculo"/>
@@ -458,7 +460,7 @@
             <w:noProof/>
             <w:webHidden/>
           </w:rPr>
-          <w:instrText xml:space="preserve"> PAGEREF _Toc230034539 \h </w:instrText>
+          <w:instrText xml:space="preserve"> PAGEREF _Toc230097267 \h </w:instrText>
         </w:r>
         <w:r>
           <w:rPr>
@@ -504,7 +506,7 @@
           <w:szCs w:val="24"/>
         </w:rPr>
       </w:pPr>
-      <w:hyperlink w:anchor="_Toc230034540" w:history="1">
+      <w:hyperlink w:anchor="_Toc230097268" w:history="1">
         <w:r>
           <w:rPr>
             <w:rStyle w:val="Hipervnculo"/>
@@ -532,7 +534,7 @@
             <w:noProof/>
             <w:webHidden/>
           </w:rPr>
-          <w:instrText xml:space="preserve"> PAGEREF _Toc230034540 \h </w:instrText>
+          <w:instrText xml:space="preserve"> PAGEREF _Toc230097268 \h </w:instrText>
         </w:r>
         <w:r>
           <w:rPr>
@@ -578,7 +580,7 @@
           <w:szCs w:val="24"/>
         </w:rPr>
       </w:pPr>
-      <w:hyperlink w:anchor="_Toc230034541" w:history="1">
+      <w:hyperlink w:anchor="_Toc230097269" w:history="1">
         <w:r>
           <w:rPr>
             <w:rStyle w:val="Hipervnculo"/>
@@ -606,7 +608,7 @@
             <w:noProof/>
             <w:webHidden/>
           </w:rPr>
-          <w:instrText xml:space="preserve"> PAGEREF _Toc230034541 \h </w:instrText>
+          <w:instrText xml:space="preserve"> PAGEREF _Toc230097269 \h </w:instrText>
         </w:r>
         <w:r>
           <w:rPr>
@@ -653,14 +655,14 @@
           <w:u w:val="none"/>
         </w:rPr>
       </w:pPr>
-      <w:hyperlink w:anchor="_Toc230034542" w:history="1">
+      <w:hyperlink w:anchor="_Toc230097270" w:history="1">
         <w:r>
           <w:rPr>
             <w:rStyle w:val="Hipervnculo"/>
             <w:noProof/>
             <w:lang w:val="en-US"/>
           </w:rPr>
-          <w:t>Containerization on Docker</w:t>
+          <w:t>CI/CD configuration</w:t>
         </w:r>
         <w:r>
           <w:rPr>
@@ -681,7 +683,7 @@
             <w:noProof/>
             <w:webHidden/>
           </w:rPr>
-          <w:instrText xml:space="preserve"> PAGEREF _Toc230034542 \h </w:instrText>
+          <w:instrText xml:space="preserve"> PAGEREF _Toc230097270 \h </w:instrText>
         </w:r>
         <w:r>
           <w:rPr>
@@ -727,14 +729,14 @@
           <w:szCs w:val="24"/>
         </w:rPr>
       </w:pPr>
-      <w:hyperlink w:anchor="_Toc230034543" w:history="1">
+      <w:hyperlink w:anchor="_Toc230097271" w:history="1">
         <w:r>
           <w:rPr>
             <w:rStyle w:val="Hipervnculo"/>
             <w:noProof/>
             <w:lang w:val="en-US"/>
           </w:rPr>
-          <w:t>Implementation</w:t>
+          <w:t>Containerization on Docker</w:t>
         </w:r>
         <w:r>
           <w:rPr>
@@ -755,7 +757,7 @@
             <w:noProof/>
             <w:webHidden/>
           </w:rPr>
-          <w:instrText xml:space="preserve"> PAGEREF _Toc230034543 \h </w:instrText>
+          <w:instrText xml:space="preserve"> PAGEREF _Toc230097271 \h </w:instrText>
         </w:r>
         <w:r>
           <w:rPr>
@@ -776,6 +778,80 @@
             <w:webHidden/>
           </w:rPr>
           <w:t>6</w:t>
+        </w:r>
+        <w:r>
+          <w:rPr>
+            <w:noProof/>
+            <w:webHidden/>
+          </w:rPr>
+          <w:fldChar w:fldCharType="end"/>
+        </w:r>
+      </w:hyperlink>
+    </w:p>
+    <w:p>
+      <w:pPr>
+        <w:pStyle w:val="TDC2"/>
+        <w:tabs>
+          <w:tab w:val="right" w:leader="underscore" w:pos="8828"/>
+        </w:tabs>
+        <w:rPr>
+          <w:b w:val="0"/>
+          <w:bCs w:val="0"/>
+          <w:smallCaps w:val="0"/>
+          <w:noProof/>
+          <w:sz w:val="24"/>
+          <w:szCs w:val="24"/>
+        </w:rPr>
+      </w:pPr>
+      <w:hyperlink w:anchor="_Toc230097272" w:history="1">
+        <w:r>
+          <w:rPr>
+            <w:rStyle w:val="Hipervnculo"/>
+            <w:noProof/>
+            <w:lang w:val="en-US"/>
+          </w:rPr>
+          <w:t>Azure</w:t>
+        </w:r>
+        <w:r>
+          <w:rPr>
+            <w:noProof/>
+            <w:webHidden/>
+          </w:rPr>
+          <w:tab/>
+        </w:r>
+        <w:r>
+          <w:rPr>
+            <w:noProof/>
+            <w:webHidden/>
+          </w:rPr>
+          <w:fldChar w:fldCharType="begin"/>
+        </w:r>
+        <w:r>
+          <w:rPr>
+            <w:noProof/>
+            <w:webHidden/>
+          </w:rPr>
+          <w:instrText xml:space="preserve"> PAGEREF _Toc230097272 \h </w:instrText>
+        </w:r>
+        <w:r>
+          <w:rPr>
+            <w:noProof/>
+            <w:webHidden/>
+          </w:rPr>
+        </w:r>
+        <w:r>
+          <w:rPr>
+            <w:noProof/>
+            <w:webHidden/>
+          </w:rPr>
+          <w:fldChar w:fldCharType="separate"/>
+        </w:r>
+        <w:r>
+          <w:rPr>
+            <w:noProof/>
+            <w:webHidden/>
+          </w:rPr>
+          <w:t>7</w:t>
         </w:r>
         <w:r>
           <w:rPr>
@@ -822,7 +898,7 @@
           <w:lang w:val="en-US"/>
         </w:rPr>
       </w:pPr>
-      <w:bookmarkStart w:id="0" w:name="_Toc230034538"/>
+      <w:bookmarkStart w:id="0" w:name="_Toc230097266"/>
       <w:r>
         <w:rPr>
           <w:color w:val="CC3333"/>
@@ -852,7 +928,7 @@
           <w:lang w:val="en-US"/>
         </w:rPr>
       </w:pPr>
-      <w:bookmarkStart w:id="1" w:name="_Toc230034539"/>
+      <w:bookmarkStart w:id="1" w:name="_Toc230097267"/>
       <w:r>
         <w:rPr>
           <w:rStyle w:val="Ttulo2Car"/>
@@ -921,7 +997,7 @@
           <w:lang w:val="en-US"/>
         </w:rPr>
       </w:pPr>
-      <w:bookmarkStart w:id="2" w:name="_Toc230034540"/>
+      <w:bookmarkStart w:id="2" w:name="_Toc230097268"/>
       <w:r>
         <w:rPr>
           <w:lang w:val="en-US"/>
@@ -1195,20 +1271,8 @@
                 <w14:ligatures w14:val="none"/>
               </w:rPr>
               <w:br/>
-            </w:r>
-            <w:proofErr w:type="spellStart"/>
-            <w:r>
-              <w:rPr>
-                <w:rFonts w:eastAsia="Times New Roman" w:cs="Times New Roman"/>
-                <w:color w:val="000000"/>
-                <w:kern w:val="0"/>
-                <w:sz w:val="22"/>
-                <w:szCs w:val="22"/>
-                <w14:ligatures w14:val="none"/>
-              </w:rPr>
               <w:t>Background</w:t>
             </w:r>
-            <w:proofErr w:type="spellEnd"/>
           </w:p>
         </w:tc>
         <w:tc>
@@ -1716,49 +1780,7 @@
         <w:rPr>
           <w:lang w:val="en-US"/>
         </w:rPr>
-        <w:t xml:space="preserve">on seven components (Intro, </w:t>
-      </w:r>
-      <w:proofErr w:type="gramStart"/>
-      <w:r>
-        <w:rPr>
-          <w:lang w:val="en-US"/>
-        </w:rPr>
-        <w:t>About</w:t>
-      </w:r>
-      <w:proofErr w:type="gramEnd"/>
-      <w:r>
-        <w:rPr>
-          <w:lang w:val="en-US"/>
-        </w:rPr>
-        <w:t xml:space="preserve"> me, Career, Education, Skills &amp; Certs, Projects and Contact) each one developed on different JSXs. The NavBar possesses access to each of these segments and </w:t>
-      </w:r>
-      <w:proofErr w:type="gramStart"/>
-      <w:r>
-        <w:rPr>
-          <w:lang w:val="en-US"/>
-        </w:rPr>
-        <w:t>allows</w:t>
-      </w:r>
-      <w:proofErr w:type="gramEnd"/>
-      <w:r>
-        <w:rPr>
-          <w:lang w:val="en-US"/>
-        </w:rPr>
-        <w:t xml:space="preserve"> to </w:t>
-      </w:r>
-      <w:proofErr w:type="gramStart"/>
-      <w:r>
-        <w:rPr>
-          <w:lang w:val="en-US"/>
-        </w:rPr>
-        <w:t>return back</w:t>
-      </w:r>
-      <w:proofErr w:type="gramEnd"/>
-      <w:r>
-        <w:rPr>
-          <w:lang w:val="en-US"/>
-        </w:rPr>
-        <w:t xml:space="preserve"> to the top easily</w:t>
+        <w:t>on seven components (Intro, About me, Career, Education, Skills &amp; Certs, Projects and Contact) each one developed on different JSXs. The NavBar possesses access to each of these segments and allows to return back to the top easily</w:t>
       </w:r>
       <w:r>
         <w:rPr>
@@ -1776,21 +1798,7 @@
         <w:rPr>
           <w:lang w:val="en-US"/>
         </w:rPr>
-        <w:t xml:space="preserve">. The footer has my name and </w:t>
-      </w:r>
-      <w:proofErr w:type="gramStart"/>
-      <w:r>
-        <w:rPr>
-          <w:lang w:val="en-US"/>
-        </w:rPr>
-        <w:t>the last</w:t>
-      </w:r>
-      <w:proofErr w:type="gramEnd"/>
-      <w:r>
-        <w:rPr>
-          <w:lang w:val="en-US"/>
-        </w:rPr>
-        <w:t xml:space="preserve"> year the website was updated.</w:t>
+        <w:t>. The footer has my name and the last year the website was updated.</w:t>
       </w:r>
     </w:p>
     <w:p>
@@ -1814,7 +1822,7 @@
           <w:lang w:val="en-US"/>
         </w:rPr>
       </w:pPr>
-      <w:bookmarkStart w:id="3" w:name="_Toc230034541"/>
+      <w:bookmarkStart w:id="3" w:name="_Toc230097269"/>
       <w:r>
         <w:rPr>
           <w:lang w:val="en-US"/>
@@ -1833,21 +1841,7 @@
         <w:rPr>
           <w:lang w:val="en-US"/>
         </w:rPr>
-        <w:t>The project follows a modular, component-based structure, where all core logic is organized inside the /</w:t>
-      </w:r>
-      <w:proofErr w:type="spellStart"/>
-      <w:r>
-        <w:rPr>
-          <w:lang w:val="en-US"/>
-        </w:rPr>
-        <w:t>src</w:t>
-      </w:r>
-      <w:proofErr w:type="spellEnd"/>
-      <w:r>
-        <w:rPr>
-          <w:lang w:val="en-US"/>
-        </w:rPr>
-        <w:t xml:space="preserve"> directory.</w:t>
+        <w:t>The project follows a modular, component-based structure, where all core logic is organized inside the /src directory.</w:t>
       </w:r>
     </w:p>
     <w:p>
@@ -1879,16 +1873,8 @@
         <w:rPr>
           <w:lang w:val="en-US"/>
         </w:rPr>
-        <w:t xml:space="preserve"> within the </w:t>
-      </w:r>
-      <w:proofErr w:type="spellStart"/>
-      <w:r>
-        <w:rPr>
-          <w:lang w:val="en-US"/>
-        </w:rPr>
-        <w:t>Index.j</w:t>
-      </w:r>
-      <w:proofErr w:type="spellEnd"/>
+        <w:t xml:space="preserve"> within the Index.j</w:t>
+      </w:r>
       <w:r>
         <w:rPr>
           <w:lang w:val="en-US"/>
@@ -1915,34 +1901,12 @@
           <w:lang w:val="en-US"/>
         </w:rPr>
       </w:pPr>
-      <w:proofErr w:type="spellStart"/>
       <w:r>
         <w:rPr>
           <w:lang w:val="en-US"/>
         </w:rPr>
         <w:lastRenderedPageBreak/>
-        <w:t>App.jsx</w:t>
-      </w:r>
-      <w:proofErr w:type="spellEnd"/>
-      <w:r>
-        <w:rPr>
-          <w:lang w:val="en-US"/>
-        </w:rPr>
-        <w:t xml:space="preserve"> defines the main layout, and </w:t>
-      </w:r>
-      <w:proofErr w:type="spellStart"/>
-      <w:r>
-        <w:rPr>
-          <w:lang w:val="en-US"/>
-        </w:rPr>
-        <w:t>Main.jsx</w:t>
-      </w:r>
-      <w:proofErr w:type="spellEnd"/>
-      <w:r>
-        <w:rPr>
-          <w:lang w:val="en-US"/>
-        </w:rPr>
-        <w:t xml:space="preserve"> handles application rendering.</w:t>
+        <w:t>App.jsx defines the main layout, and Main.jsx handles application rendering.</w:t>
       </w:r>
     </w:p>
     <w:p>
@@ -2021,6 +1985,7 @@
           <w:lang w:val="en-US"/>
         </w:rPr>
       </w:pPr>
+      <w:bookmarkStart w:id="4" w:name="_Toc230097270"/>
       <w:r>
         <w:rPr>
           <w:lang w:val="en-US"/>
@@ -2028,80 +1993,42 @@
         <w:lastRenderedPageBreak/>
         <w:t>CI/CD configuration</w:t>
       </w:r>
-    </w:p>
-    <w:p>
-      <w:pPr>
-        <w:rPr>
-          <w:lang w:val="en-US"/>
-        </w:rPr>
-      </w:pPr>
-    </w:p>
-    <w:p>
-      <w:pPr>
-        <w:rPr>
-          <w:rFonts w:ascii="Berlin Sans FB Demi" w:eastAsiaTheme="majorEastAsia" w:hAnsi="Berlin Sans FB Demi" w:cstheme="majorBidi"/>
-          <w:sz w:val="44"/>
-          <w:szCs w:val="32"/>
-          <w:lang w:val="en-US"/>
-        </w:rPr>
-      </w:pPr>
-      <w:r>
-        <w:rPr>
-          <w:rFonts w:ascii="Berlin Sans FB Demi" w:eastAsiaTheme="majorEastAsia" w:hAnsi="Berlin Sans FB Demi" w:cstheme="majorBidi"/>
-          <w:sz w:val="44"/>
-          <w:szCs w:val="32"/>
+      <w:bookmarkEnd w:id="4"/>
+    </w:p>
+    <w:p>
+      <w:pPr>
+        <w:rPr>
+          <w:lang w:val="en-US"/>
+        </w:rPr>
+      </w:pPr>
+    </w:p>
+    <w:p>
+      <w:pPr>
+        <w:pStyle w:val="Ttulo2"/>
+        <w:rPr>
+          <w:lang w:val="en-US"/>
+        </w:rPr>
+      </w:pPr>
+      <w:bookmarkStart w:id="5" w:name="_Toc230097271"/>
+      <w:r>
+        <w:rPr>
           <w:lang w:val="en-US"/>
         </w:rPr>
         <w:t>Containerization on Docker</w:t>
       </w:r>
-    </w:p>
-    <w:p>
-      <w:pPr>
-        <w:rPr>
-          <w:lang w:val="en-US"/>
-        </w:rPr>
-      </w:pPr>
-      <w:r>
-        <w:rPr>
-          <w:lang w:val="en-US"/>
-        </w:rPr>
-        <w:t xml:space="preserve">Created </w:t>
-      </w:r>
-      <w:proofErr w:type="spellStart"/>
-      <w:r>
-        <w:rPr>
-          <w:lang w:val="en-US"/>
-        </w:rPr>
-        <w:t>Dockerfile</w:t>
-      </w:r>
-      <w:proofErr w:type="spellEnd"/>
-      <w:r>
-        <w:rPr>
-          <w:lang w:val="en-US"/>
-        </w:rPr>
-        <w:t xml:space="preserve"> </w:t>
-      </w:r>
-      <w:proofErr w:type="gramStart"/>
-      <w:r>
-        <w:rPr>
-          <w:lang w:val="en-US"/>
-        </w:rPr>
-        <w:t>and .</w:t>
-      </w:r>
-      <w:proofErr w:type="spellStart"/>
-      <w:r>
-        <w:rPr>
-          <w:lang w:val="en-US"/>
-        </w:rPr>
-        <w:t>dockerignore</w:t>
-      </w:r>
-      <w:proofErr w:type="spellEnd"/>
-      <w:proofErr w:type="gramEnd"/>
-      <w:r>
-        <w:rPr>
-          <w:lang w:val="en-US"/>
-        </w:rPr>
-        <w:t xml:space="preserve"> into React project root.</w:t>
+      <w:bookmarkEnd w:id="5"/>
+    </w:p>
+    <w:p>
+      <w:pPr>
+        <w:rPr>
+          <w:lang w:val="en-US"/>
+        </w:rPr>
+      </w:pPr>
+      <w:r>
+        <w:rPr>
+          <w:lang w:val="en-US"/>
+        </w:rPr>
+        <w:t>Created Dockerfile and .dockerignore into React project root.</w:t>
       </w:r>
       <w:r>
         <w:rPr>
@@ -2130,6 +2057,7 @@
       </w:pPr>
       <w:r>
         <w:rPr>
+          <w:noProof/>
           <w:u w:val="single"/>
           <w:lang w:val="en-US"/>
         </w:rPr>
@@ -2222,47 +2150,17 @@
           <w:lang w:val="en-US"/>
         </w:rPr>
       </w:pPr>
-      <w:proofErr w:type="gramStart"/>
-      <w:r>
-        <w:rPr>
-          <w:lang w:val="en-US"/>
-        </w:rPr>
-        <w:t>.docker</w:t>
-      </w:r>
-      <w:proofErr w:type="gramEnd"/>
-      <w:r>
-        <w:rPr>
-          <w:lang w:val="en-US"/>
-        </w:rPr>
-        <w:t xml:space="preserve"> </w:t>
-      </w:r>
-      <w:proofErr w:type="gramStart"/>
-      <w:r>
-        <w:rPr>
-          <w:lang w:val="en-US"/>
-        </w:rPr>
-        <w:t>ignore</w:t>
-      </w:r>
-      <w:proofErr w:type="gramEnd"/>
-      <w:r>
-        <w:rPr>
-          <w:lang w:val="en-US"/>
-        </w:rPr>
-        <w:t xml:space="preserve"> </w:t>
-      </w:r>
-      <w:proofErr w:type="gramStart"/>
-      <w:r>
-        <w:rPr>
-          <w:lang w:val="en-US"/>
-        </w:rPr>
-        <w:t>makes</w:t>
-      </w:r>
-      <w:proofErr w:type="gramEnd"/>
-      <w:r>
-        <w:rPr>
-          <w:lang w:val="en-US"/>
-        </w:rPr>
-        <w:t xml:space="preserve"> sure unnecessary files for contained versions of the website don’t add up space to the container nor cause compatibility issues:</w:t>
+      <w:r>
+        <w:rPr>
+          <w:lang w:val="en-US"/>
+        </w:rPr>
+        <w:t xml:space="preserve">.docker ignore </w:t>
+      </w:r>
+      <w:r>
+        <w:rPr>
+          <w:lang w:val="en-US"/>
+        </w:rPr>
+        <w:t>makes sure unnecessary files for contained versions of the website don’t add up space to the container nor cause compatibility issues:</w:t>
       </w:r>
     </w:p>
     <w:p>
@@ -2274,7 +2172,6 @@
           <w:lang w:val="en-US"/>
         </w:rPr>
       </w:pPr>
-      <w:proofErr w:type="spellStart"/>
       <w:r>
         <w:rPr>
           <w:sz w:val="28"/>
@@ -2283,125 +2180,242 @@
         </w:rPr>
         <w:t>node_modules</w:t>
       </w:r>
-      <w:proofErr w:type="spellEnd"/>
-    </w:p>
-    <w:p>
-      <w:pPr>
-        <w:pStyle w:val="Sinespaciado"/>
+      <w:r>
         <w:rPr>
           <w:sz w:val="28"/>
           <w:szCs w:val="28"/>
           <w:lang w:val="en-US"/>
         </w:rPr>
-      </w:pPr>
-      <w:proofErr w:type="gramStart"/>
-      <w:r>
+        <w:tab/>
+      </w:r>
+    </w:p>
+    <w:p>
+      <w:pPr>
+        <w:pStyle w:val="Sinespaciado"/>
         <w:rPr>
           <w:sz w:val="28"/>
           <w:szCs w:val="28"/>
           <w:lang w:val="en-US"/>
         </w:rPr>
-        <w:t>.git</w:t>
-      </w:r>
-      <w:proofErr w:type="gramEnd"/>
-    </w:p>
-    <w:p>
-      <w:pPr>
-        <w:pStyle w:val="Sinespaciado"/>
+      </w:pPr>
+      <w:r>
         <w:rPr>
           <w:sz w:val="28"/>
           <w:szCs w:val="28"/>
           <w:lang w:val="en-US"/>
         </w:rPr>
-      </w:pPr>
-      <w:proofErr w:type="gramStart"/>
+        <w:t>.git</w:t>
+      </w:r>
       <w:r>
         <w:rPr>
           <w:sz w:val="28"/>
           <w:szCs w:val="28"/>
           <w:lang w:val="en-US"/>
         </w:rPr>
-        <w:t>.</w:t>
-      </w:r>
-      <w:proofErr w:type="spellStart"/>
+        <w:tab/>
+      </w:r>
       <w:r>
         <w:rPr>
           <w:sz w:val="28"/>
           <w:szCs w:val="28"/>
           <w:lang w:val="en-US"/>
         </w:rPr>
-        <w:t>github</w:t>
-      </w:r>
-      <w:proofErr w:type="spellEnd"/>
-      <w:proofErr w:type="gramEnd"/>
-    </w:p>
-    <w:p>
-      <w:pPr>
-        <w:pStyle w:val="Sinespaciado"/>
+        <w:tab/>
+      </w:r>
+      <w:r>
         <w:rPr>
           <w:sz w:val="28"/>
           <w:szCs w:val="28"/>
           <w:lang w:val="en-US"/>
         </w:rPr>
-      </w:pPr>
-      <w:proofErr w:type="spellStart"/>
-      <w:r>
+        <w:tab/>
+      </w:r>
+    </w:p>
+    <w:p>
+      <w:pPr>
+        <w:pStyle w:val="Sinespaciado"/>
         <w:rPr>
           <w:sz w:val="28"/>
           <w:szCs w:val="28"/>
           <w:lang w:val="en-US"/>
         </w:rPr>
-        <w:t>dist</w:t>
-      </w:r>
-      <w:proofErr w:type="spellEnd"/>
-    </w:p>
-    <w:p>
-      <w:pPr>
-        <w:pStyle w:val="Sinespaciado"/>
+      </w:pPr>
+      <w:r>
         <w:rPr>
           <w:sz w:val="28"/>
           <w:szCs w:val="28"/>
           <w:lang w:val="en-US"/>
         </w:rPr>
-      </w:pPr>
+        <w:t>.github</w:t>
+      </w:r>
       <w:r>
         <w:rPr>
           <w:sz w:val="28"/>
           <w:szCs w:val="28"/>
           <w:lang w:val="en-US"/>
         </w:rPr>
-        <w:t>build</w:t>
-      </w:r>
-    </w:p>
-    <w:p>
-      <w:pPr>
-        <w:pStyle w:val="Sinespaciado"/>
+        <w:tab/>
+      </w:r>
+      <w:r>
         <w:rPr>
           <w:sz w:val="28"/>
           <w:szCs w:val="28"/>
           <w:lang w:val="en-US"/>
         </w:rPr>
-      </w:pPr>
-      <w:proofErr w:type="gramStart"/>
-      <w:r>
+        <w:tab/>
+      </w:r>
+    </w:p>
+    <w:p>
+      <w:pPr>
+        <w:pStyle w:val="Sinespaciado"/>
         <w:rPr>
           <w:sz w:val="28"/>
           <w:szCs w:val="28"/>
           <w:lang w:val="en-US"/>
         </w:rPr>
-        <w:t>.env</w:t>
-      </w:r>
-      <w:proofErr w:type="gramEnd"/>
-    </w:p>
-    <w:p>
-      <w:pPr>
-        <w:pStyle w:val="Sinespaciado"/>
+      </w:pPr>
+      <w:r>
         <w:rPr>
           <w:sz w:val="28"/>
           <w:szCs w:val="28"/>
           <w:lang w:val="en-US"/>
         </w:rPr>
-      </w:pPr>
+        <w:t>d</w:t>
+      </w:r>
+      <w:r>
+        <w:rPr>
+          <w:sz w:val="28"/>
+          <w:szCs w:val="28"/>
+          <w:lang w:val="en-US"/>
+        </w:rPr>
+        <w:t>ist</w:t>
+      </w:r>
+      <w:r>
+        <w:rPr>
+          <w:sz w:val="28"/>
+          <w:szCs w:val="28"/>
+          <w:lang w:val="en-US"/>
+        </w:rPr>
+        <w:tab/>
+      </w:r>
+      <w:r>
+        <w:rPr>
+          <w:sz w:val="28"/>
+          <w:szCs w:val="28"/>
+          <w:lang w:val="en-US"/>
+        </w:rPr>
+        <w:tab/>
+      </w:r>
+      <w:r>
+        <w:rPr>
+          <w:sz w:val="28"/>
+          <w:szCs w:val="28"/>
+          <w:lang w:val="en-US"/>
+        </w:rPr>
+        <w:tab/>
+      </w:r>
+    </w:p>
+    <w:p>
+      <w:pPr>
+        <w:pStyle w:val="Sinespaciado"/>
+        <w:rPr>
+          <w:sz w:val="28"/>
+          <w:szCs w:val="28"/>
+          <w:lang w:val="en-US"/>
+        </w:rPr>
+      </w:pPr>
+      <w:r>
+        <w:rPr>
+          <w:sz w:val="28"/>
+          <w:szCs w:val="28"/>
+          <w:lang w:val="en-US"/>
+        </w:rPr>
+        <w:t>B</w:t>
+      </w:r>
+      <w:r>
+        <w:rPr>
+          <w:sz w:val="28"/>
+          <w:szCs w:val="28"/>
+          <w:lang w:val="en-US"/>
+        </w:rPr>
+        <w:t>uild</w:t>
+      </w:r>
+      <w:r>
+        <w:rPr>
+          <w:sz w:val="28"/>
+          <w:szCs w:val="28"/>
+          <w:lang w:val="en-US"/>
+        </w:rPr>
+        <w:tab/>
+      </w:r>
+      <w:r>
+        <w:rPr>
+          <w:sz w:val="28"/>
+          <w:szCs w:val="28"/>
+          <w:lang w:val="en-US"/>
+        </w:rPr>
+        <w:tab/>
+      </w:r>
+      <w:r>
+        <w:rPr>
+          <w:sz w:val="28"/>
+          <w:szCs w:val="28"/>
+          <w:lang w:val="en-US"/>
+        </w:rPr>
+        <w:tab/>
+      </w:r>
+    </w:p>
+    <w:p>
+      <w:pPr>
+        <w:pStyle w:val="Sinespaciado"/>
+        <w:rPr>
+          <w:sz w:val="28"/>
+          <w:szCs w:val="28"/>
+          <w:lang w:val="en-US"/>
+        </w:rPr>
+      </w:pPr>
+      <w:r>
+        <w:rPr>
+          <w:sz w:val="28"/>
+          <w:szCs w:val="28"/>
+          <w:lang w:val="en-US"/>
+        </w:rPr>
+        <w:t>.env</w:t>
+      </w:r>
+      <w:r>
+        <w:rPr>
+          <w:sz w:val="28"/>
+          <w:szCs w:val="28"/>
+          <w:lang w:val="en-US"/>
+        </w:rPr>
+        <w:tab/>
+      </w:r>
+    </w:p>
+    <w:p>
+      <w:pPr>
+        <w:pStyle w:val="Sinespaciado"/>
+        <w:rPr>
+          <w:sz w:val="28"/>
+          <w:szCs w:val="28"/>
+          <w:lang w:val="en-US"/>
+        </w:rPr>
+      </w:pPr>
+      <w:r>
+        <w:rPr>
+          <w:sz w:val="28"/>
+          <w:szCs w:val="28"/>
+          <w:lang w:val="en-US"/>
+        </w:rPr>
+        <w:tab/>
+      </w:r>
+      <w:r>
+        <w:rPr>
+          <w:sz w:val="28"/>
+          <w:szCs w:val="28"/>
+          <w:lang w:val="en-US"/>
+        </w:rPr>
+        <w:tab/>
+      </w:r>
     </w:p>
     <w:p>
       <w:pPr>
@@ -2414,6 +2428,673 @@
           <w:lang w:val="en-US"/>
         </w:rPr>
         <w:t xml:space="preserve">Once this was completed, the image was uploaded to the GitHub repository. </w:t>
+      </w:r>
+    </w:p>
+    <w:p>
+      <w:pPr>
+        <w:rPr>
+          <w:lang w:val="en-US"/>
+        </w:rPr>
+      </w:pPr>
+    </w:p>
+    <w:p>
+      <w:pPr>
+        <w:rPr>
+          <w:lang w:val="en-US"/>
+        </w:rPr>
+      </w:pPr>
+    </w:p>
+    <w:p>
+      <w:pPr>
+        <w:rPr>
+          <w:lang w:val="en-US"/>
+        </w:rPr>
+      </w:pPr>
+    </w:p>
+    <w:p>
+      <w:pPr>
+        <w:pStyle w:val="Ttulo2"/>
+        <w:rPr>
+          <w:lang w:val="en-US"/>
+        </w:rPr>
+      </w:pPr>
+      <w:bookmarkStart w:id="6" w:name="_Toc230097272"/>
+      <w:r>
+        <w:rPr>
+          <w:lang w:val="en-US"/>
+        </w:rPr>
+        <w:lastRenderedPageBreak/>
+        <w:t>Azure</w:t>
+      </w:r>
+      <w:bookmarkEnd w:id="6"/>
+      <w:r>
+        <w:rPr>
+          <w:lang w:val="en-US"/>
+        </w:rPr>
+        <w:t xml:space="preserve"> Cloude</w:t>
+      </w:r>
+    </w:p>
+    <w:p>
+      <w:pPr>
+        <w:rPr>
+          <w:lang w:val="en-US"/>
+        </w:rPr>
+      </w:pPr>
+      <w:r>
+        <w:rPr>
+          <w:lang w:val="en-US"/>
+        </w:rPr>
+        <w:t xml:space="preserve">On the Azure cloud environment, created the Subscription </w:t>
+      </w:r>
+      <w:r>
+        <w:rPr>
+          <w:lang w:val="en-US"/>
+        </w:rPr>
+        <w:t>“</w:t>
+      </w:r>
+      <w:r>
+        <w:rPr>
+          <w:lang w:val="en-US"/>
+        </w:rPr>
+        <w:t>PersonalProjects</w:t>
+      </w:r>
+      <w:r>
+        <w:rPr>
+          <w:lang w:val="en-US"/>
+        </w:rPr>
+        <w:t>”</w:t>
+      </w:r>
+      <w:r>
+        <w:rPr>
+          <w:lang w:val="en-US"/>
+        </w:rPr>
+        <w:t xml:space="preserve"> to handle this portfolio and other public projects. </w:t>
+      </w:r>
+      <w:r>
+        <w:rPr>
+          <w:noProof/>
+          <w:lang w:val="en-US"/>
+        </w:rPr>
+        <w:drawing>
+          <wp:inline distT="0" distB="0" distL="0" distR="0" wp14:anchorId="5E3D4388" wp14:editId="49016C0B">
+            <wp:extent cx="5612130" cy="318135"/>
+            <wp:effectExtent l="0" t="0" r="7620" b="5715"/>
+            <wp:docPr id="1766043397" name="Imagen 1"/>
+            <wp:cNvGraphicFramePr>
+              <a:graphicFrameLocks xmlns:a="http://schemas.openxmlformats.org/drawingml/2006/main" noChangeAspect="1"/>
+            </wp:cNvGraphicFramePr>
+            <a:graphic xmlns:a="http://schemas.openxmlformats.org/drawingml/2006/main">
+              <a:graphicData uri="http://schemas.openxmlformats.org/drawingml/2006/picture">
+                <pic:pic xmlns:pic="http://schemas.openxmlformats.org/drawingml/2006/picture">
+                  <pic:nvPicPr>
+                    <pic:cNvPr id="1766043397" name=""/>
+                    <pic:cNvPicPr/>
+                  </pic:nvPicPr>
+                  <pic:blipFill>
+                    <a:blip r:embed="rId9"/>
+                    <a:stretch>
+                      <a:fillRect/>
+                    </a:stretch>
+                  </pic:blipFill>
+                  <pic:spPr>
+                    <a:xfrm>
+                      <a:off x="0" y="0"/>
+                      <a:ext cx="5612130" cy="318135"/>
+                    </a:xfrm>
+                    <a:prstGeom prst="rect">
+                      <a:avLst/>
+                    </a:prstGeom>
+                  </pic:spPr>
+                </pic:pic>
+              </a:graphicData>
+            </a:graphic>
+          </wp:inline>
+        </w:drawing>
+      </w:r>
+    </w:p>
+    <w:p>
+      <w:pPr>
+        <w:rPr>
+          <w:lang w:val="en-US"/>
+        </w:rPr>
+      </w:pPr>
+    </w:p>
+    <w:p>
+      <w:pPr>
+        <w:rPr>
+          <w:lang w:val="en-US"/>
+        </w:rPr>
+      </w:pPr>
+      <w:r>
+        <w:rPr>
+          <w:lang w:val="en-US"/>
+        </w:rPr>
+        <w:t>Created resource group rg-portfolio-prod</w:t>
+      </w:r>
+      <w:r>
+        <w:rPr>
+          <w:lang w:val="en-US"/>
+        </w:rPr>
+        <w:t xml:space="preserve"> </w:t>
+      </w:r>
+      <w:r>
+        <w:rPr>
+          <w:lang w:val="en-US"/>
+        </w:rPr>
+        <w:t>to encapsulate the resources related to this project.</w:t>
+      </w:r>
+      <w:r>
+        <w:rPr>
+          <w:lang w:val="en-US"/>
+        </w:rPr>
+        <w:t xml:space="preserve"> Central US was chosen due to larger availability of </w:t>
+      </w:r>
+      <w:r>
+        <w:rPr>
+          <w:lang w:val="en-US"/>
+        </w:rPr>
+        <w:t xml:space="preserve">free plan </w:t>
+      </w:r>
+      <w:r>
+        <w:rPr>
+          <w:lang w:val="en-US"/>
+        </w:rPr>
+        <w:t>resources and geographical location.</w:t>
+      </w:r>
+    </w:p>
+    <w:p>
+      <w:pPr>
+        <w:rPr>
+          <w:lang w:val="en-US"/>
+        </w:rPr>
+      </w:pPr>
+      <w:r>
+        <w:rPr>
+          <w:noProof/>
+          <w:lang w:val="en-US"/>
+        </w:rPr>
+        <w:drawing>
+          <wp:inline distT="0" distB="0" distL="0" distR="0" wp14:anchorId="59913590" wp14:editId="0758792D">
+            <wp:extent cx="5612130" cy="1468755"/>
+            <wp:effectExtent l="0" t="0" r="7620" b="0"/>
+            <wp:docPr id="847905421" name="Imagen 1"/>
+            <wp:cNvGraphicFramePr>
+              <a:graphicFrameLocks xmlns:a="http://schemas.openxmlformats.org/drawingml/2006/main" noChangeAspect="1"/>
+            </wp:cNvGraphicFramePr>
+            <a:graphic xmlns:a="http://schemas.openxmlformats.org/drawingml/2006/main">
+              <a:graphicData uri="http://schemas.openxmlformats.org/drawingml/2006/picture">
+                <pic:pic xmlns:pic="http://schemas.openxmlformats.org/drawingml/2006/picture">
+                  <pic:nvPicPr>
+                    <pic:cNvPr id="847905421" name=""/>
+                    <pic:cNvPicPr/>
+                  </pic:nvPicPr>
+                  <pic:blipFill>
+                    <a:blip r:embed="rId10"/>
+                    <a:stretch>
+                      <a:fillRect/>
+                    </a:stretch>
+                  </pic:blipFill>
+                  <pic:spPr>
+                    <a:xfrm>
+                      <a:off x="0" y="0"/>
+                      <a:ext cx="5612130" cy="1468755"/>
+                    </a:xfrm>
+                    <a:prstGeom prst="rect">
+                      <a:avLst/>
+                    </a:prstGeom>
+                  </pic:spPr>
+                </pic:pic>
+              </a:graphicData>
+            </a:graphic>
+          </wp:inline>
+        </w:drawing>
+      </w:r>
+    </w:p>
+    <w:p>
+      <w:pPr>
+        <w:rPr>
+          <w:lang w:val="en-US"/>
+        </w:rPr>
+      </w:pPr>
+      <w:r>
+        <w:rPr>
+          <w:noProof/>
+          <w:lang w:val="en-US"/>
+        </w:rPr>
+        <w:drawing>
+          <wp:inline distT="0" distB="0" distL="0" distR="0" wp14:anchorId="604FCB63" wp14:editId="1E1B0B9A">
+            <wp:extent cx="5854700" cy="390525"/>
+            <wp:effectExtent l="0" t="0" r="0" b="9525"/>
+            <wp:docPr id="1461996937" name="Imagen 1"/>
+            <wp:cNvGraphicFramePr>
+              <a:graphicFrameLocks xmlns:a="http://schemas.openxmlformats.org/drawingml/2006/main" noChangeAspect="1"/>
+            </wp:cNvGraphicFramePr>
+            <a:graphic xmlns:a="http://schemas.openxmlformats.org/drawingml/2006/main">
+              <a:graphicData uri="http://schemas.openxmlformats.org/drawingml/2006/picture">
+                <pic:pic xmlns:pic="http://schemas.openxmlformats.org/drawingml/2006/picture">
+                  <pic:nvPicPr>
+                    <pic:cNvPr id="1461996937" name=""/>
+                    <pic:cNvPicPr/>
+                  </pic:nvPicPr>
+                  <pic:blipFill>
+                    <a:blip r:embed="rId11"/>
+                    <a:stretch>
+                      <a:fillRect/>
+                    </a:stretch>
+                  </pic:blipFill>
+                  <pic:spPr>
+                    <a:xfrm>
+                      <a:off x="0" y="0"/>
+                      <a:ext cx="5858013" cy="390746"/>
+                    </a:xfrm>
+                    <a:prstGeom prst="rect">
+                      <a:avLst/>
+                    </a:prstGeom>
+                  </pic:spPr>
+                </pic:pic>
+              </a:graphicData>
+            </a:graphic>
+          </wp:inline>
+        </w:drawing>
+      </w:r>
+    </w:p>
+    <w:p>
+      <w:pPr>
+        <w:rPr>
+          <w:lang w:val="en-US"/>
+        </w:rPr>
+      </w:pPr>
+      <w:r>
+        <w:rPr>
+          <w:lang w:val="en-US"/>
+        </w:rPr>
+        <w:t xml:space="preserve">Added an app service </w:t>
+      </w:r>
+      <w:r>
+        <w:rPr>
+          <w:lang w:val="en-US"/>
+        </w:rPr>
+        <w:t xml:space="preserve">plan </w:t>
+      </w:r>
+      <w:r>
+        <w:rPr>
+          <w:lang w:val="en-US"/>
+        </w:rPr>
+        <w:t xml:space="preserve">based on Linux using SKU </w:t>
+      </w:r>
+      <w:r>
+        <w:rPr>
+          <w:lang w:val="en-US"/>
+        </w:rPr>
+        <w:t>B</w:t>
+      </w:r>
+      <w:r>
+        <w:rPr>
+          <w:lang w:val="en-US"/>
+        </w:rPr>
+        <w:t xml:space="preserve">1 for a </w:t>
+      </w:r>
+      <w:r>
+        <w:rPr>
+          <w:lang w:val="en-US"/>
+        </w:rPr>
+        <w:t>low</w:t>
+      </w:r>
+      <w:r>
+        <w:rPr>
+          <w:lang w:val="en-US"/>
+        </w:rPr>
+        <w:t xml:space="preserve"> cost website</w:t>
+      </w:r>
+      <w:r>
+        <w:rPr>
+          <w:lang w:val="en-US"/>
+        </w:rPr>
+        <w:t xml:space="preserve"> able to hold custom domains</w:t>
+      </w:r>
+      <w:r>
+        <w:rPr>
+          <w:lang w:val="en-US"/>
+        </w:rPr>
+        <w:t>, we can take advantage of this service tier due to the nature of this project.</w:t>
+      </w:r>
+    </w:p>
+    <w:p>
+      <w:pPr>
+        <w:rPr>
+          <w:lang w:val="en-US"/>
+        </w:rPr>
+      </w:pPr>
+      <w:r>
+        <w:rPr>
+          <w:noProof/>
+          <w:lang w:val="en-US"/>
+        </w:rPr>
+        <w:drawing>
+          <wp:inline distT="0" distB="0" distL="0" distR="0" wp14:anchorId="5ACAAEBE" wp14:editId="3667EE65">
+            <wp:extent cx="5612130" cy="803910"/>
+            <wp:effectExtent l="0" t="0" r="7620" b="0"/>
+            <wp:docPr id="189072791" name="Imagen 1"/>
+            <wp:cNvGraphicFramePr>
+              <a:graphicFrameLocks xmlns:a="http://schemas.openxmlformats.org/drawingml/2006/main" noChangeAspect="1"/>
+            </wp:cNvGraphicFramePr>
+            <a:graphic xmlns:a="http://schemas.openxmlformats.org/drawingml/2006/main">
+              <a:graphicData uri="http://schemas.openxmlformats.org/drawingml/2006/picture">
+                <pic:pic xmlns:pic="http://schemas.openxmlformats.org/drawingml/2006/picture">
+                  <pic:nvPicPr>
+                    <pic:cNvPr id="189072791" name=""/>
+                    <pic:cNvPicPr/>
+                  </pic:nvPicPr>
+                  <pic:blipFill>
+                    <a:blip r:embed="rId12"/>
+                    <a:stretch>
+                      <a:fillRect/>
+                    </a:stretch>
+                  </pic:blipFill>
+                  <pic:spPr>
+                    <a:xfrm>
+                      <a:off x="0" y="0"/>
+                      <a:ext cx="5612130" cy="803910"/>
+                    </a:xfrm>
+                    <a:prstGeom prst="rect">
+                      <a:avLst/>
+                    </a:prstGeom>
+                  </pic:spPr>
+                </pic:pic>
+              </a:graphicData>
+            </a:graphic>
+          </wp:inline>
+        </w:drawing>
+      </w:r>
+    </w:p>
+    <w:p>
+      <w:pPr>
+        <w:rPr>
+          <w:lang w:val="en-US"/>
+        </w:rPr>
+      </w:pPr>
+      <w:r>
+        <w:rPr>
+          <w:noProof/>
+          <w:lang w:val="en-US"/>
+        </w:rPr>
+        <w:lastRenderedPageBreak/>
+        <w:drawing>
+          <wp:inline distT="0" distB="0" distL="0" distR="0" wp14:anchorId="3A91CDB9" wp14:editId="118E398F">
+            <wp:extent cx="5612130" cy="545465"/>
+            <wp:effectExtent l="0" t="0" r="7620" b="6985"/>
+            <wp:docPr id="2075169497" name="Imagen 1"/>
+            <wp:cNvGraphicFramePr>
+              <a:graphicFrameLocks xmlns:a="http://schemas.openxmlformats.org/drawingml/2006/main" noChangeAspect="1"/>
+            </wp:cNvGraphicFramePr>
+            <a:graphic xmlns:a="http://schemas.openxmlformats.org/drawingml/2006/main">
+              <a:graphicData uri="http://schemas.openxmlformats.org/drawingml/2006/picture">
+                <pic:pic xmlns:pic="http://schemas.openxmlformats.org/drawingml/2006/picture">
+                  <pic:nvPicPr>
+                    <pic:cNvPr id="2075169497" name=""/>
+                    <pic:cNvPicPr/>
+                  </pic:nvPicPr>
+                  <pic:blipFill>
+                    <a:blip r:embed="rId13"/>
+                    <a:stretch>
+                      <a:fillRect/>
+                    </a:stretch>
+                  </pic:blipFill>
+                  <pic:spPr>
+                    <a:xfrm>
+                      <a:off x="0" y="0"/>
+                      <a:ext cx="5612130" cy="545465"/>
+                    </a:xfrm>
+                    <a:prstGeom prst="rect">
+                      <a:avLst/>
+                    </a:prstGeom>
+                  </pic:spPr>
+                </pic:pic>
+              </a:graphicData>
+            </a:graphic>
+          </wp:inline>
+        </w:drawing>
+      </w:r>
+    </w:p>
+    <w:p>
+      <w:pPr>
+        <w:rPr>
+          <w:lang w:val="en-US"/>
+        </w:rPr>
+      </w:pPr>
+      <w:r>
+        <w:rPr>
+          <w:lang w:val="en-US"/>
+        </w:rPr>
+        <w:t>Added the webapp within the app service plan previously created.</w:t>
+      </w:r>
+      <w:r>
+        <w:rPr>
+          <w:lang w:val="en-US"/>
+        </w:rPr>
+        <w:t xml:space="preserve"> It currently contains an ngix placeholder while we configure our container.</w:t>
+      </w:r>
+    </w:p>
+    <w:p>
+      <w:pPr>
+        <w:rPr>
+          <w:lang w:val="en-US"/>
+        </w:rPr>
+      </w:pPr>
+      <w:r>
+        <w:rPr>
+          <w:noProof/>
+          <w:lang w:val="en-US"/>
+        </w:rPr>
+        <w:drawing>
+          <wp:inline distT="0" distB="0" distL="0" distR="0" wp14:anchorId="10B9A6E9" wp14:editId="32247CCE">
+            <wp:extent cx="5612130" cy="495300"/>
+            <wp:effectExtent l="0" t="0" r="7620" b="0"/>
+            <wp:docPr id="624439852" name="Imagen 1"/>
+            <wp:cNvGraphicFramePr>
+              <a:graphicFrameLocks xmlns:a="http://schemas.openxmlformats.org/drawingml/2006/main" noChangeAspect="1"/>
+            </wp:cNvGraphicFramePr>
+            <a:graphic xmlns:a="http://schemas.openxmlformats.org/drawingml/2006/main">
+              <a:graphicData uri="http://schemas.openxmlformats.org/drawingml/2006/picture">
+                <pic:pic xmlns:pic="http://schemas.openxmlformats.org/drawingml/2006/picture">
+                  <pic:nvPicPr>
+                    <pic:cNvPr id="624439852" name=""/>
+                    <pic:cNvPicPr/>
+                  </pic:nvPicPr>
+                  <pic:blipFill>
+                    <a:blip r:embed="rId14"/>
+                    <a:stretch>
+                      <a:fillRect/>
+                    </a:stretch>
+                  </pic:blipFill>
+                  <pic:spPr>
+                    <a:xfrm>
+                      <a:off x="0" y="0"/>
+                      <a:ext cx="5612130" cy="495300"/>
+                    </a:xfrm>
+                    <a:prstGeom prst="rect">
+                      <a:avLst/>
+                    </a:prstGeom>
+                  </pic:spPr>
+                </pic:pic>
+              </a:graphicData>
+            </a:graphic>
+          </wp:inline>
+        </w:drawing>
+      </w:r>
+    </w:p>
+    <w:p>
+      <w:pPr>
+        <w:rPr>
+          <w:lang w:val="en-US"/>
+        </w:rPr>
+      </w:pPr>
+      <w:r>
+        <w:rPr>
+          <w:lang w:val="en-US"/>
+        </w:rPr>
+        <w:t xml:space="preserve">Added custom domain linked to GoDaddy purchased domain juanjosecastroz.com. The domain is binded to an </w:t>
+      </w:r>
+      <w:r>
+        <w:rPr>
+          <w:lang w:val="en-US"/>
+        </w:rPr>
+        <w:t>SNI SSL</w:t>
+      </w:r>
+      <w:r>
+        <w:rPr>
+          <w:lang w:val="en-US"/>
+        </w:rPr>
+        <w:t xml:space="preserve"> Azure certificate created specifically for this custom domain.</w:t>
+      </w:r>
+    </w:p>
+    <w:p>
+      <w:pPr>
+        <w:rPr>
+          <w:lang w:val="en-US"/>
+        </w:rPr>
+      </w:pPr>
+      <w:r>
+        <w:rPr>
+          <w:noProof/>
+          <w:lang w:val="en-US"/>
+        </w:rPr>
+        <w:drawing>
+          <wp:inline distT="0" distB="0" distL="0" distR="0" wp14:anchorId="10497BB3" wp14:editId="66E07927">
+            <wp:extent cx="5612130" cy="2196465"/>
+            <wp:effectExtent l="76200" t="76200" r="140970" b="127635"/>
+            <wp:docPr id="1918091635" name="Imagen 1"/>
+            <wp:cNvGraphicFramePr>
+              <a:graphicFrameLocks xmlns:a="http://schemas.openxmlformats.org/drawingml/2006/main" noChangeAspect="1"/>
+            </wp:cNvGraphicFramePr>
+            <a:graphic xmlns:a="http://schemas.openxmlformats.org/drawingml/2006/main">
+              <a:graphicData uri="http://schemas.openxmlformats.org/drawingml/2006/picture">
+                <pic:pic xmlns:pic="http://schemas.openxmlformats.org/drawingml/2006/picture">
+                  <pic:nvPicPr>
+                    <pic:cNvPr id="1918091635" name=""/>
+                    <pic:cNvPicPr/>
+                  </pic:nvPicPr>
+                  <pic:blipFill>
+                    <a:blip r:embed="rId15"/>
+                    <a:stretch>
+                      <a:fillRect/>
+                    </a:stretch>
+                  </pic:blipFill>
+                  <pic:spPr>
+                    <a:xfrm>
+                      <a:off x="0" y="0"/>
+                      <a:ext cx="5612130" cy="2196465"/>
+                    </a:xfrm>
+                    <a:prstGeom prst="rect">
+                      <a:avLst/>
+                    </a:prstGeom>
+                    <a:ln w="38100" cap="sq">
+                      <a:solidFill>
+                        <a:srgbClr val="000000"/>
+                      </a:solidFill>
+                      <a:prstDash val="solid"/>
+                      <a:miter lim="800000"/>
+                    </a:ln>
+                    <a:effectLst>
+                      <a:outerShdw blurRad="50800" dist="38100" dir="2700000" algn="tl" rotWithShape="0">
+                        <a:srgbClr val="000000">
+                          <a:alpha val="43000"/>
+                        </a:srgbClr>
+                      </a:outerShdw>
+                    </a:effectLst>
+                  </pic:spPr>
+                </pic:pic>
+              </a:graphicData>
+            </a:graphic>
+          </wp:inline>
+        </w:drawing>
+      </w:r>
+    </w:p>
+    <w:p>
+      <w:pPr>
+        <w:rPr>
+          <w:lang w:val="en-US"/>
+        </w:rPr>
+      </w:pPr>
+      <w:r>
+        <w:rPr>
+          <w:lang w:val="en-US"/>
+        </w:rPr>
+        <w:t xml:space="preserve">Once </w:t>
+      </w:r>
+    </w:p>
+    <w:p>
+      <w:pPr>
+        <w:rPr>
+          <w:lang w:val="en-US"/>
+        </w:rPr>
+      </w:pPr>
+      <w:r>
+        <w:rPr>
+          <w:lang w:val="en-US"/>
+        </w:rPr>
+        <w:br w:type="page"/>
+      </w:r>
+    </w:p>
+    <w:p>
+      <w:pPr>
+        <w:rPr>
+          <w:lang w:val="en-US"/>
+        </w:rPr>
+      </w:pPr>
+      <w:r>
+        <w:rPr>
+          <w:lang w:val="en-US"/>
+        </w:rPr>
+        <w:lastRenderedPageBreak/>
+        <w:t>Added a static we app connecting my current GitHub repository using the free plan  and taking branch main as production.</w:t>
+      </w:r>
+    </w:p>
+    <w:p>
+      <w:pPr>
+        <w:rPr>
+          <w:lang w:val="en-US"/>
+        </w:rPr>
+      </w:pPr>
+      <w:r>
+        <w:rPr>
+          <w:lang w:val="en-US"/>
+        </w:rPr>
+        <w:drawing>
+          <wp:inline distT="0" distB="0" distL="0" distR="0" wp14:anchorId="724E35A0" wp14:editId="2A9464F5">
+            <wp:extent cx="3914775" cy="4462150"/>
+            <wp:effectExtent l="0" t="0" r="0" b="0"/>
+            <wp:docPr id="1896153028" name="Imagen 1"/>
+            <wp:cNvGraphicFramePr>
+              <a:graphicFrameLocks xmlns:a="http://schemas.openxmlformats.org/drawingml/2006/main" noChangeAspect="1"/>
+            </wp:cNvGraphicFramePr>
+            <a:graphic xmlns:a="http://schemas.openxmlformats.org/drawingml/2006/main">
+              <a:graphicData uri="http://schemas.openxmlformats.org/drawingml/2006/picture">
+                <pic:pic xmlns:pic="http://schemas.openxmlformats.org/drawingml/2006/picture">
+                  <pic:nvPicPr>
+                    <pic:cNvPr id="1896153028" name=""/>
+                    <pic:cNvPicPr/>
+                  </pic:nvPicPr>
+                  <pic:blipFill>
+                    <a:blip r:embed="rId16"/>
+                    <a:stretch>
+                      <a:fillRect/>
+                    </a:stretch>
+                  </pic:blipFill>
+                  <pic:spPr>
+                    <a:xfrm>
+                      <a:off x="0" y="0"/>
+                      <a:ext cx="3921058" cy="4469312"/>
+                    </a:xfrm>
+                    <a:prstGeom prst="rect">
+                      <a:avLst/>
+                    </a:prstGeom>
+                  </pic:spPr>
+                </pic:pic>
+              </a:graphicData>
+            </a:graphic>
+          </wp:inline>
+        </w:drawing>
       </w:r>
     </w:p>
     <w:sectPr>
@@ -3033,6 +3714,7 @@
   <w:style w:type="character" w:default="1" w:styleId="Fuentedeprrafopredeter">
     <w:name w:val="Default Paragraph Font"/>
     <w:uiPriority w:val="1"/>
+    <w:semiHidden/>
     <w:unhideWhenUsed/>
   </w:style>
   <w:style w:type="table" w:default="1" w:styleId="Tablanormal">

</xml_diff>

<commit_message>
Added Documentation component and link to it in App.jsx. Updated Hero.jsx to add a background image and a dark overlay for better text visibility. Added Logo and Title to index.html
</commit_message>
<xml_diff>
--- a/Documentation/Personal Web Portfolio Documentation.docx
+++ b/Documentation/Personal Web Portfolio Documentation.docx
@@ -237,18 +237,18 @@
           <w:lang w:val="en-US"/>
         </w:rPr>
         <w:drawing>
-          <wp:anchor distT="0" distB="0" distL="114300" distR="114300" simplePos="0" relativeHeight="251658240" behindDoc="0" locked="0" layoutInCell="1" allowOverlap="1" wp14:anchorId="69219F7A" wp14:editId="5A1E3975">
+          <wp:anchor distT="0" distB="0" distL="114300" distR="114300" simplePos="0" relativeHeight="251661312" behindDoc="0" locked="0" layoutInCell="1" allowOverlap="1" wp14:anchorId="326C0555" wp14:editId="2B0F47EC">
             <wp:simplePos x="0" y="0"/>
             <wp:positionH relativeFrom="margin">
-              <wp:posOffset>771525</wp:posOffset>
+              <wp:align>center</wp:align>
             </wp:positionH>
             <wp:positionV relativeFrom="paragraph">
-              <wp:posOffset>197749</wp:posOffset>
+              <wp:posOffset>314242</wp:posOffset>
             </wp:positionV>
-            <wp:extent cx="4037610" cy="3157368"/>
-            <wp:effectExtent l="0" t="0" r="1270" b="5080"/>
+            <wp:extent cx="3633746" cy="2822547"/>
+            <wp:effectExtent l="0" t="0" r="5080" b="0"/>
             <wp:wrapNone/>
-            <wp:docPr id="1137005222" name="Imagen 1"/>
+            <wp:docPr id="1139308094" name="Imagen 1"/>
             <wp:cNvGraphicFramePr>
               <a:graphicFrameLocks xmlns:a="http://schemas.openxmlformats.org/drawingml/2006/main" noChangeAspect="1"/>
             </wp:cNvGraphicFramePr>
@@ -256,10 +256,10 @@
               <a:graphicData uri="http://schemas.openxmlformats.org/drawingml/2006/picture">
                 <pic:pic xmlns:pic="http://schemas.openxmlformats.org/drawingml/2006/picture">
                   <pic:nvPicPr>
-                    <pic:cNvPr id="1137005222" name=""/>
+                    <pic:cNvPr id="1139308094" name=""/>
                     <pic:cNvPicPr/>
                   </pic:nvPicPr>
-                  <pic:blipFill rotWithShape="1">
+                  <pic:blipFill>
                     <a:blip r:embed="rId5" cstate="print">
                       <a:extLst>
                         <a:ext uri="{28A0092B-C50C-407E-A947-70E740481C1C}">
@@ -267,27 +267,18 @@
                         </a:ext>
                       </a:extLst>
                     </a:blip>
-                    <a:srcRect l="19518" t="9971" r="21937" b="-1"/>
                     <a:stretch>
                       <a:fillRect/>
                     </a:stretch>
                   </pic:blipFill>
-                  <pic:spPr bwMode="auto">
+                  <pic:spPr>
                     <a:xfrm>
                       <a:off x="0" y="0"/>
-                      <a:ext cx="4037610" cy="3157368"/>
+                      <a:ext cx="3633746" cy="2822547"/>
                     </a:xfrm>
                     <a:prstGeom prst="rect">
                       <a:avLst/>
                     </a:prstGeom>
-                    <a:ln>
-                      <a:noFill/>
-                    </a:ln>
-                    <a:extLst>
-                      <a:ext uri="{53640926-AAD7-44D8-BBD7-CCE9431645EC}">
-                        <a14:shadowObscured xmlns:a14="http://schemas.microsoft.com/office/drawing/2010/main"/>
-                      </a:ext>
-                    </a:extLst>
                   </pic:spPr>
                 </pic:pic>
               </a:graphicData>
@@ -358,7 +349,7 @@
         </w:rPr>
         <w:fldChar w:fldCharType="separate"/>
       </w:r>
-      <w:hyperlink w:anchor="_Toc230097266" w:history="1">
+      <w:hyperlink w:anchor="_Toc230533606" w:history="1">
         <w:r>
           <w:rPr>
             <w:rStyle w:val="Hipervnculo"/>
@@ -386,7 +377,7 @@
             <w:noProof/>
             <w:webHidden/>
           </w:rPr>
-          <w:instrText xml:space="preserve"> PAGEREF _Toc230097266 \h </w:instrText>
+          <w:instrText xml:space="preserve"> PAGEREF _Toc230533606 \h </w:instrText>
         </w:r>
         <w:r>
           <w:rPr>
@@ -432,7 +423,7 @@
           <w:szCs w:val="24"/>
         </w:rPr>
       </w:pPr>
-      <w:hyperlink w:anchor="_Toc230097267" w:history="1">
+      <w:hyperlink w:anchor="_Toc230533607" w:history="1">
         <w:r>
           <w:rPr>
             <w:rStyle w:val="Hipervnculo"/>
@@ -460,7 +451,7 @@
             <w:noProof/>
             <w:webHidden/>
           </w:rPr>
-          <w:instrText xml:space="preserve"> PAGEREF _Toc230097267 \h </w:instrText>
+          <w:instrText xml:space="preserve"> PAGEREF _Toc230533607 \h </w:instrText>
         </w:r>
         <w:r>
           <w:rPr>
@@ -506,7 +497,7 @@
           <w:szCs w:val="24"/>
         </w:rPr>
       </w:pPr>
-      <w:hyperlink w:anchor="_Toc230097268" w:history="1">
+      <w:hyperlink w:anchor="_Toc230533608" w:history="1">
         <w:r>
           <w:rPr>
             <w:rStyle w:val="Hipervnculo"/>
@@ -534,7 +525,7 @@
             <w:noProof/>
             <w:webHidden/>
           </w:rPr>
-          <w:instrText xml:space="preserve"> PAGEREF _Toc230097268 \h </w:instrText>
+          <w:instrText xml:space="preserve"> PAGEREF _Toc230533608 \h </w:instrText>
         </w:r>
         <w:r>
           <w:rPr>
@@ -580,7 +571,7 @@
           <w:szCs w:val="24"/>
         </w:rPr>
       </w:pPr>
-      <w:hyperlink w:anchor="_Toc230097269" w:history="1">
+      <w:hyperlink w:anchor="_Toc230533609" w:history="1">
         <w:r>
           <w:rPr>
             <w:rStyle w:val="Hipervnculo"/>
@@ -608,7 +599,7 @@
             <w:noProof/>
             <w:webHidden/>
           </w:rPr>
-          <w:instrText xml:space="preserve"> PAGEREF _Toc230097269 \h </w:instrText>
+          <w:instrText xml:space="preserve"> PAGEREF _Toc230533609 \h </w:instrText>
         </w:r>
         <w:r>
           <w:rPr>
@@ -655,7 +646,7 @@
           <w:u w:val="none"/>
         </w:rPr>
       </w:pPr>
-      <w:hyperlink w:anchor="_Toc230097270" w:history="1">
+      <w:hyperlink w:anchor="_Toc230533610" w:history="1">
         <w:r>
           <w:rPr>
             <w:rStyle w:val="Hipervnculo"/>
@@ -683,7 +674,7 @@
             <w:noProof/>
             <w:webHidden/>
           </w:rPr>
-          <w:instrText xml:space="preserve"> PAGEREF _Toc230097270 \h </w:instrText>
+          <w:instrText xml:space="preserve"> PAGEREF _Toc230533610 \h </w:instrText>
         </w:r>
         <w:r>
           <w:rPr>
@@ -729,7 +720,7 @@
           <w:szCs w:val="24"/>
         </w:rPr>
       </w:pPr>
-      <w:hyperlink w:anchor="_Toc230097271" w:history="1">
+      <w:hyperlink w:anchor="_Toc230533611" w:history="1">
         <w:r>
           <w:rPr>
             <w:rStyle w:val="Hipervnculo"/>
@@ -757,7 +748,7 @@
             <w:noProof/>
             <w:webHidden/>
           </w:rPr>
-          <w:instrText xml:space="preserve"> PAGEREF _Toc230097271 \h </w:instrText>
+          <w:instrText xml:space="preserve"> PAGEREF _Toc230533611 \h </w:instrText>
         </w:r>
         <w:r>
           <w:rPr>
@@ -803,14 +794,14 @@
           <w:szCs w:val="24"/>
         </w:rPr>
       </w:pPr>
-      <w:hyperlink w:anchor="_Toc230097272" w:history="1">
+      <w:hyperlink w:anchor="_Toc230533612" w:history="1">
         <w:r>
           <w:rPr>
             <w:rStyle w:val="Hipervnculo"/>
             <w:noProof/>
             <w:lang w:val="en-US"/>
           </w:rPr>
-          <w:t>Azure</w:t>
+          <w:t>Azure Cloud</w:t>
         </w:r>
         <w:r>
           <w:rPr>
@@ -831,7 +822,7 @@
             <w:noProof/>
             <w:webHidden/>
           </w:rPr>
-          <w:instrText xml:space="preserve"> PAGEREF _Toc230097272 \h </w:instrText>
+          <w:instrText xml:space="preserve"> PAGEREF _Toc230533612 \h </w:instrText>
         </w:r>
         <w:r>
           <w:rPr>
@@ -852,6 +843,80 @@
             <w:webHidden/>
           </w:rPr>
           <w:t>7</w:t>
+        </w:r>
+        <w:r>
+          <w:rPr>
+            <w:noProof/>
+            <w:webHidden/>
+          </w:rPr>
+          <w:fldChar w:fldCharType="end"/>
+        </w:r>
+      </w:hyperlink>
+    </w:p>
+    <w:p>
+      <w:pPr>
+        <w:pStyle w:val="TDC2"/>
+        <w:tabs>
+          <w:tab w:val="right" w:leader="underscore" w:pos="8828"/>
+        </w:tabs>
+        <w:rPr>
+          <w:b w:val="0"/>
+          <w:bCs w:val="0"/>
+          <w:smallCaps w:val="0"/>
+          <w:noProof/>
+          <w:sz w:val="24"/>
+          <w:szCs w:val="24"/>
+        </w:rPr>
+      </w:pPr>
+      <w:hyperlink w:anchor="_Toc230533613" w:history="1">
+        <w:r>
+          <w:rPr>
+            <w:rStyle w:val="Hipervnculo"/>
+            <w:noProof/>
+            <w:lang w:val="en-US"/>
+          </w:rPr>
+          <w:t>GitHub Actions</w:t>
+        </w:r>
+        <w:r>
+          <w:rPr>
+            <w:noProof/>
+            <w:webHidden/>
+          </w:rPr>
+          <w:tab/>
+        </w:r>
+        <w:r>
+          <w:rPr>
+            <w:noProof/>
+            <w:webHidden/>
+          </w:rPr>
+          <w:fldChar w:fldCharType="begin"/>
+        </w:r>
+        <w:r>
+          <w:rPr>
+            <w:noProof/>
+            <w:webHidden/>
+          </w:rPr>
+          <w:instrText xml:space="preserve"> PAGEREF _Toc230533613 \h </w:instrText>
+        </w:r>
+        <w:r>
+          <w:rPr>
+            <w:noProof/>
+            <w:webHidden/>
+          </w:rPr>
+        </w:r>
+        <w:r>
+          <w:rPr>
+            <w:noProof/>
+            <w:webHidden/>
+          </w:rPr>
+          <w:fldChar w:fldCharType="separate"/>
+        </w:r>
+        <w:r>
+          <w:rPr>
+            <w:noProof/>
+            <w:webHidden/>
+          </w:rPr>
+          <w:t>10</w:t>
         </w:r>
         <w:r>
           <w:rPr>
@@ -898,7 +963,7 @@
           <w:lang w:val="en-US"/>
         </w:rPr>
       </w:pPr>
-      <w:bookmarkStart w:id="0" w:name="_Toc230097266"/>
+      <w:bookmarkStart w:id="0" w:name="_Toc230533606"/>
       <w:r>
         <w:rPr>
           <w:color w:val="CC3333"/>
@@ -928,7 +993,7 @@
           <w:lang w:val="en-US"/>
         </w:rPr>
       </w:pPr>
-      <w:bookmarkStart w:id="1" w:name="_Toc230097267"/>
+      <w:bookmarkStart w:id="1" w:name="_Toc230533607"/>
       <w:r>
         <w:rPr>
           <w:rStyle w:val="Ttulo2Car"/>
@@ -997,7 +1062,7 @@
           <w:lang w:val="en-US"/>
         </w:rPr>
       </w:pPr>
-      <w:bookmarkStart w:id="2" w:name="_Toc230097268"/>
+      <w:bookmarkStart w:id="2" w:name="_Toc230533608"/>
       <w:r>
         <w:rPr>
           <w:lang w:val="en-US"/>
@@ -1271,8 +1336,20 @@
                 <w14:ligatures w14:val="none"/>
               </w:rPr>
               <w:br/>
+            </w:r>
+            <w:proofErr w:type="spellStart"/>
+            <w:r>
+              <w:rPr>
+                <w:rFonts w:eastAsia="Times New Roman" w:cs="Times New Roman"/>
+                <w:color w:val="000000"/>
+                <w:kern w:val="0"/>
+                <w:sz w:val="22"/>
+                <w:szCs w:val="22"/>
+                <w14:ligatures w14:val="none"/>
+              </w:rPr>
               <w:t>Background</w:t>
             </w:r>
+            <w:proofErr w:type="spellEnd"/>
           </w:p>
         </w:tc>
         <w:tc>
@@ -1320,8 +1397,20 @@
                 <w14:ligatures w14:val="none"/>
               </w:rPr>
               <w:br/>
+            </w:r>
+            <w:proofErr w:type="spellStart"/>
+            <w:r>
+              <w:rPr>
+                <w:rFonts w:eastAsia="Times New Roman" w:cs="Times New Roman"/>
+                <w:color w:val="000000"/>
+                <w:kern w:val="0"/>
+                <w:sz w:val="22"/>
+                <w:szCs w:val="22"/>
+                <w14:ligatures w14:val="none"/>
+              </w:rPr>
               <w:t>Cards</w:t>
             </w:r>
+            <w:proofErr w:type="spellEnd"/>
           </w:p>
         </w:tc>
         <w:tc>
@@ -1418,8 +1507,44 @@
                 <w14:ligatures w14:val="none"/>
               </w:rPr>
               <w:br/>
-              <w:t>Primary accent</w:t>
             </w:r>
+            <w:proofErr w:type="spellStart"/>
+            <w:r>
+              <w:rPr>
+                <w:rFonts w:eastAsia="Times New Roman" w:cs="Times New Roman"/>
+                <w:color w:val="000000"/>
+                <w:kern w:val="0"/>
+                <w:sz w:val="22"/>
+                <w:szCs w:val="22"/>
+                <w14:ligatures w14:val="none"/>
+              </w:rPr>
+              <w:t>Primary</w:t>
+            </w:r>
+            <w:proofErr w:type="spellEnd"/>
+            <w:r>
+              <w:rPr>
+                <w:rFonts w:eastAsia="Times New Roman" w:cs="Times New Roman"/>
+                <w:color w:val="000000"/>
+                <w:kern w:val="0"/>
+                <w:sz w:val="22"/>
+                <w:szCs w:val="22"/>
+                <w14:ligatures w14:val="none"/>
+              </w:rPr>
+              <w:t xml:space="preserve"> </w:t>
+            </w:r>
+            <w:proofErr w:type="spellStart"/>
+            <w:r>
+              <w:rPr>
+                <w:rFonts w:eastAsia="Times New Roman" w:cs="Times New Roman"/>
+                <w:color w:val="000000"/>
+                <w:kern w:val="0"/>
+                <w:sz w:val="22"/>
+                <w:szCs w:val="22"/>
+                <w14:ligatures w14:val="none"/>
+              </w:rPr>
+              <w:t>accent</w:t>
+            </w:r>
+            <w:proofErr w:type="spellEnd"/>
           </w:p>
         </w:tc>
       </w:tr>
@@ -1588,8 +1713,44 @@
                 <w14:ligatures w14:val="none"/>
               </w:rPr>
               <w:br/>
-              <w:t>Primary text</w:t>
             </w:r>
+            <w:proofErr w:type="spellStart"/>
+            <w:r>
+              <w:rPr>
+                <w:rFonts w:eastAsia="Times New Roman" w:cs="Times New Roman"/>
+                <w:color w:val="000000"/>
+                <w:kern w:val="0"/>
+                <w:sz w:val="22"/>
+                <w:szCs w:val="22"/>
+                <w14:ligatures w14:val="none"/>
+              </w:rPr>
+              <w:t>Primary</w:t>
+            </w:r>
+            <w:proofErr w:type="spellEnd"/>
+            <w:r>
+              <w:rPr>
+                <w:rFonts w:eastAsia="Times New Roman" w:cs="Times New Roman"/>
+                <w:color w:val="000000"/>
+                <w:kern w:val="0"/>
+                <w:sz w:val="22"/>
+                <w:szCs w:val="22"/>
+                <w14:ligatures w14:val="none"/>
+              </w:rPr>
+              <w:t xml:space="preserve"> </w:t>
+            </w:r>
+            <w:proofErr w:type="spellStart"/>
+            <w:r>
+              <w:rPr>
+                <w:rFonts w:eastAsia="Times New Roman" w:cs="Times New Roman"/>
+                <w:color w:val="000000"/>
+                <w:kern w:val="0"/>
+                <w:sz w:val="22"/>
+                <w:szCs w:val="22"/>
+                <w14:ligatures w14:val="none"/>
+              </w:rPr>
+              <w:t>text</w:t>
+            </w:r>
+            <w:proofErr w:type="spellEnd"/>
           </w:p>
         </w:tc>
         <w:tc>
@@ -1686,8 +1847,44 @@
                 <w14:ligatures w14:val="none"/>
               </w:rPr>
               <w:br/>
-              <w:t>Secondary text</w:t>
             </w:r>
+            <w:proofErr w:type="spellStart"/>
+            <w:r>
+              <w:rPr>
+                <w:rFonts w:eastAsia="Times New Roman" w:cs="Times New Roman"/>
+                <w:color w:val="000000"/>
+                <w:kern w:val="0"/>
+                <w:sz w:val="22"/>
+                <w:szCs w:val="22"/>
+                <w14:ligatures w14:val="none"/>
+              </w:rPr>
+              <w:t>Secondary</w:t>
+            </w:r>
+            <w:proofErr w:type="spellEnd"/>
+            <w:r>
+              <w:rPr>
+                <w:rFonts w:eastAsia="Times New Roman" w:cs="Times New Roman"/>
+                <w:color w:val="000000"/>
+                <w:kern w:val="0"/>
+                <w:sz w:val="22"/>
+                <w:szCs w:val="22"/>
+                <w14:ligatures w14:val="none"/>
+              </w:rPr>
+              <w:t xml:space="preserve"> </w:t>
+            </w:r>
+            <w:proofErr w:type="spellStart"/>
+            <w:r>
+              <w:rPr>
+                <w:rFonts w:eastAsia="Times New Roman" w:cs="Times New Roman"/>
+                <w:color w:val="000000"/>
+                <w:kern w:val="0"/>
+                <w:sz w:val="22"/>
+                <w:szCs w:val="22"/>
+                <w14:ligatures w14:val="none"/>
+              </w:rPr>
+              <w:t>text</w:t>
+            </w:r>
+            <w:proofErr w:type="spellEnd"/>
           </w:p>
         </w:tc>
         <w:tc>
@@ -1736,7 +1933,21 @@
         <w:rPr>
           <w:lang w:val="en-US"/>
         </w:rPr>
-        <w:t>The website is distributed within a “One Page Design” and the NavBar is a “Sticky” one as it is always visible.</w:t>
+        <w:t xml:space="preserve">The website is distributed within a “One Page Design” and the </w:t>
+      </w:r>
+      <w:proofErr w:type="spellStart"/>
+      <w:r>
+        <w:rPr>
+          <w:lang w:val="en-US"/>
+        </w:rPr>
+        <w:t>NavBar</w:t>
+      </w:r>
+      <w:proofErr w:type="spellEnd"/>
+      <w:r>
+        <w:rPr>
+          <w:lang w:val="en-US"/>
+        </w:rPr>
+        <w:t xml:space="preserve"> is a “Sticky” one as it is always visible.</w:t>
       </w:r>
       <w:r>
         <w:rPr>
@@ -1780,7 +1991,63 @@
         <w:rPr>
           <w:lang w:val="en-US"/>
         </w:rPr>
-        <w:t>on seven components (Intro, About me, Career, Education, Skills &amp; Certs, Projects and Contact) each one developed on different JSXs. The NavBar possesses access to each of these segments and allows to return back to the top easily</w:t>
+        <w:t xml:space="preserve">on seven components (Intro, </w:t>
+      </w:r>
+      <w:proofErr w:type="gramStart"/>
+      <w:r>
+        <w:rPr>
+          <w:lang w:val="en-US"/>
+        </w:rPr>
+        <w:t>About</w:t>
+      </w:r>
+      <w:proofErr w:type="gramEnd"/>
+      <w:r>
+        <w:rPr>
+          <w:lang w:val="en-US"/>
+        </w:rPr>
+        <w:t xml:space="preserve"> me, Career, Education, Skills &amp; Certs, Projects and Contact) each one developed on different JSXs. The </w:t>
+      </w:r>
+      <w:proofErr w:type="spellStart"/>
+      <w:r>
+        <w:rPr>
+          <w:lang w:val="en-US"/>
+        </w:rPr>
+        <w:t>NavBar</w:t>
+      </w:r>
+      <w:proofErr w:type="spellEnd"/>
+      <w:r>
+        <w:rPr>
+          <w:lang w:val="en-US"/>
+        </w:rPr>
+        <w:t xml:space="preserve"> possesses access to each of these segments and </w:t>
+      </w:r>
+      <w:proofErr w:type="gramStart"/>
+      <w:r>
+        <w:rPr>
+          <w:lang w:val="en-US"/>
+        </w:rPr>
+        <w:t>allows</w:t>
+      </w:r>
+      <w:proofErr w:type="gramEnd"/>
+      <w:r>
+        <w:rPr>
+          <w:lang w:val="en-US"/>
+        </w:rPr>
+        <w:t xml:space="preserve"> to </w:t>
+      </w:r>
+      <w:proofErr w:type="gramStart"/>
+      <w:r>
+        <w:rPr>
+          <w:lang w:val="en-US"/>
+        </w:rPr>
+        <w:t>return back</w:t>
+      </w:r>
+      <w:proofErr w:type="gramEnd"/>
+      <w:r>
+        <w:rPr>
+          <w:lang w:val="en-US"/>
+        </w:rPr>
+        <w:t xml:space="preserve"> to the top easily</w:t>
       </w:r>
       <w:r>
         <w:rPr>
@@ -1798,7 +2065,21 @@
         <w:rPr>
           <w:lang w:val="en-US"/>
         </w:rPr>
-        <w:t>. The footer has my name and the last year the website was updated.</w:t>
+        <w:t xml:space="preserve">. The footer has my name and </w:t>
+      </w:r>
+      <w:proofErr w:type="gramStart"/>
+      <w:r>
+        <w:rPr>
+          <w:lang w:val="en-US"/>
+        </w:rPr>
+        <w:t>the last</w:t>
+      </w:r>
+      <w:proofErr w:type="gramEnd"/>
+      <w:r>
+        <w:rPr>
+          <w:lang w:val="en-US"/>
+        </w:rPr>
+        <w:t xml:space="preserve"> year the website was updated.</w:t>
       </w:r>
     </w:p>
     <w:p>
@@ -1822,7 +2103,7 @@
           <w:lang w:val="en-US"/>
         </w:rPr>
       </w:pPr>
-      <w:bookmarkStart w:id="3" w:name="_Toc230097269"/>
+      <w:bookmarkStart w:id="3" w:name="_Toc230533609"/>
       <w:r>
         <w:rPr>
           <w:lang w:val="en-US"/>
@@ -1841,7 +2122,21 @@
         <w:rPr>
           <w:lang w:val="en-US"/>
         </w:rPr>
-        <w:t>The project follows a modular, component-based structure, where all core logic is organized inside the /src directory.</w:t>
+        <w:t>The project follows a modular, component-based structure, where all core logic is organized inside the /</w:t>
+      </w:r>
+      <w:proofErr w:type="spellStart"/>
+      <w:r>
+        <w:rPr>
+          <w:lang w:val="en-US"/>
+        </w:rPr>
+        <w:t>src</w:t>
+      </w:r>
+      <w:proofErr w:type="spellEnd"/>
+      <w:r>
+        <w:rPr>
+          <w:lang w:val="en-US"/>
+        </w:rPr>
+        <w:t xml:space="preserve"> directory.</w:t>
       </w:r>
     </w:p>
     <w:p>
@@ -1873,8 +2168,16 @@
         <w:rPr>
           <w:lang w:val="en-US"/>
         </w:rPr>
-        <w:t xml:space="preserve"> within the Index.j</w:t>
-      </w:r>
+        <w:t xml:space="preserve"> within the </w:t>
+      </w:r>
+      <w:proofErr w:type="spellStart"/>
+      <w:r>
+        <w:rPr>
+          <w:lang w:val="en-US"/>
+        </w:rPr>
+        <w:t>Index.j</w:t>
+      </w:r>
+      <w:proofErr w:type="spellEnd"/>
       <w:r>
         <w:rPr>
           <w:lang w:val="en-US"/>
@@ -1901,12 +2204,34 @@
           <w:lang w:val="en-US"/>
         </w:rPr>
       </w:pPr>
+      <w:proofErr w:type="spellStart"/>
       <w:r>
         <w:rPr>
           <w:lang w:val="en-US"/>
         </w:rPr>
         <w:lastRenderedPageBreak/>
-        <w:t>App.jsx defines the main layout, and Main.jsx handles application rendering.</w:t>
+        <w:t>App.jsx</w:t>
+      </w:r>
+      <w:proofErr w:type="spellEnd"/>
+      <w:r>
+        <w:rPr>
+          <w:lang w:val="en-US"/>
+        </w:rPr>
+        <w:t xml:space="preserve"> defines the main layout, and </w:t>
+      </w:r>
+      <w:proofErr w:type="spellStart"/>
+      <w:r>
+        <w:rPr>
+          <w:lang w:val="en-US"/>
+        </w:rPr>
+        <w:t>Main.jsx</w:t>
+      </w:r>
+      <w:proofErr w:type="spellEnd"/>
+      <w:r>
+        <w:rPr>
+          <w:lang w:val="en-US"/>
+        </w:rPr>
+        <w:t xml:space="preserve"> handles application rendering.</w:t>
       </w:r>
     </w:p>
     <w:p>
@@ -1934,10 +2259,10 @@
           <w:lang w:val="en-US"/>
         </w:rPr>
         <w:drawing>
-          <wp:inline distT="0" distB="0" distL="0" distR="0" wp14:anchorId="525ABFFA" wp14:editId="7E83CC62">
-            <wp:extent cx="2819794" cy="6315956"/>
-            <wp:effectExtent l="0" t="0" r="0" b="0"/>
-            <wp:docPr id="677114240" name="Imagen 1"/>
+          <wp:inline distT="0" distB="0" distL="0" distR="0" wp14:anchorId="222D381D" wp14:editId="3F0B60CD">
+            <wp:extent cx="3504491" cy="6162261"/>
+            <wp:effectExtent l="0" t="0" r="1270" b="0"/>
+            <wp:docPr id="739591579" name="Imagen 1"/>
             <wp:cNvGraphicFramePr>
               <a:graphicFrameLocks xmlns:a="http://schemas.openxmlformats.org/drawingml/2006/main" noChangeAspect="1"/>
             </wp:cNvGraphicFramePr>
@@ -1945,7 +2270,7 @@
               <a:graphicData uri="http://schemas.openxmlformats.org/drawingml/2006/picture">
                 <pic:pic xmlns:pic="http://schemas.openxmlformats.org/drawingml/2006/picture">
                   <pic:nvPicPr>
-                    <pic:cNvPr id="677114240" name=""/>
+                    <pic:cNvPr id="739591579" name=""/>
                     <pic:cNvPicPr/>
                   </pic:nvPicPr>
                   <pic:blipFill>
@@ -1957,7 +2282,7 @@
                   <pic:spPr>
                     <a:xfrm>
                       <a:off x="0" y="0"/>
-                      <a:ext cx="2819794" cy="6315956"/>
+                      <a:ext cx="3508022" cy="6168469"/>
                     </a:xfrm>
                     <a:prstGeom prst="rect">
                       <a:avLst/>
@@ -1985,7 +2310,7 @@
           <w:lang w:val="en-US"/>
         </w:rPr>
       </w:pPr>
-      <w:bookmarkStart w:id="4" w:name="_Toc230097270"/>
+      <w:bookmarkStart w:id="4" w:name="_Toc230533610"/>
       <w:r>
         <w:rPr>
           <w:lang w:val="en-US"/>
@@ -2009,7 +2334,7 @@
           <w:lang w:val="en-US"/>
         </w:rPr>
       </w:pPr>
-      <w:bookmarkStart w:id="5" w:name="_Toc230097271"/>
+      <w:bookmarkStart w:id="5" w:name="_Toc230533611"/>
       <w:r>
         <w:rPr>
           <w:lang w:val="en-US"/>
@@ -2028,7 +2353,43 @@
         <w:rPr>
           <w:lang w:val="en-US"/>
         </w:rPr>
-        <w:t>Created Dockerfile and .dockerignore into React project root.</w:t>
+        <w:t xml:space="preserve">Created </w:t>
+      </w:r>
+      <w:proofErr w:type="spellStart"/>
+      <w:r>
+        <w:rPr>
+          <w:lang w:val="en-US"/>
+        </w:rPr>
+        <w:t>Dockerfile</w:t>
+      </w:r>
+      <w:proofErr w:type="spellEnd"/>
+      <w:r>
+        <w:rPr>
+          <w:lang w:val="en-US"/>
+        </w:rPr>
+        <w:t xml:space="preserve"> </w:t>
+      </w:r>
+      <w:proofErr w:type="gramStart"/>
+      <w:r>
+        <w:rPr>
+          <w:lang w:val="en-US"/>
+        </w:rPr>
+        <w:t>and .</w:t>
+      </w:r>
+      <w:proofErr w:type="spellStart"/>
+      <w:r>
+        <w:rPr>
+          <w:lang w:val="en-US"/>
+        </w:rPr>
+        <w:t>dockerignore</w:t>
+      </w:r>
+      <w:proofErr w:type="spellEnd"/>
+      <w:proofErr w:type="gramEnd"/>
+      <w:r>
+        <w:rPr>
+          <w:lang w:val="en-US"/>
+        </w:rPr>
+        <w:t xml:space="preserve"> into React project root.</w:t>
       </w:r>
       <w:r>
         <w:rPr>
@@ -2150,17 +2511,47 @@
           <w:lang w:val="en-US"/>
         </w:rPr>
       </w:pPr>
-      <w:r>
-        <w:rPr>
-          <w:lang w:val="en-US"/>
-        </w:rPr>
-        <w:t xml:space="preserve">.docker ignore </w:t>
-      </w:r>
-      <w:r>
-        <w:rPr>
-          <w:lang w:val="en-US"/>
-        </w:rPr>
-        <w:t>makes sure unnecessary files for contained versions of the website don’t add up space to the container nor cause compatibility issues:</w:t>
+      <w:proofErr w:type="gramStart"/>
+      <w:r>
+        <w:rPr>
+          <w:lang w:val="en-US"/>
+        </w:rPr>
+        <w:t>.docker</w:t>
+      </w:r>
+      <w:proofErr w:type="gramEnd"/>
+      <w:r>
+        <w:rPr>
+          <w:lang w:val="en-US"/>
+        </w:rPr>
+        <w:t xml:space="preserve"> </w:t>
+      </w:r>
+      <w:proofErr w:type="gramStart"/>
+      <w:r>
+        <w:rPr>
+          <w:lang w:val="en-US"/>
+        </w:rPr>
+        <w:t>ignore</w:t>
+      </w:r>
+      <w:proofErr w:type="gramEnd"/>
+      <w:r>
+        <w:rPr>
+          <w:lang w:val="en-US"/>
+        </w:rPr>
+        <w:t xml:space="preserve"> </w:t>
+      </w:r>
+      <w:proofErr w:type="gramStart"/>
+      <w:r>
+        <w:rPr>
+          <w:lang w:val="en-US"/>
+        </w:rPr>
+        <w:t>makes</w:t>
+      </w:r>
+      <w:proofErr w:type="gramEnd"/>
+      <w:r>
+        <w:rPr>
+          <w:lang w:val="en-US"/>
+        </w:rPr>
+        <w:t xml:space="preserve"> sure unnecessary files for contained versions of the website don’t add up space to the container nor cause compatibility issues:</w:t>
       </w:r>
     </w:p>
     <w:p>
@@ -2172,6 +2563,7 @@
           <w:lang w:val="en-US"/>
         </w:rPr>
       </w:pPr>
+      <w:proofErr w:type="spellStart"/>
       <w:r>
         <w:rPr>
           <w:sz w:val="28"/>
@@ -2180,6 +2572,7 @@
         </w:rPr>
         <w:t>node_modules</w:t>
       </w:r>
+      <w:proofErr w:type="spellEnd"/>
       <w:r>
         <w:rPr>
           <w:sz w:val="28"/>
@@ -2198,6 +2591,7 @@
           <w:lang w:val="en-US"/>
         </w:rPr>
       </w:pPr>
+      <w:proofErr w:type="gramStart"/>
       <w:r>
         <w:rPr>
           <w:sz w:val="28"/>
@@ -2206,6 +2600,7 @@
         </w:rPr>
         <w:t>.git</w:t>
       </w:r>
+      <w:proofErr w:type="gramEnd"/>
       <w:r>
         <w:rPr>
           <w:sz w:val="28"/>
@@ -2240,22 +2635,26 @@
           <w:lang w:val="en-US"/>
         </w:rPr>
       </w:pPr>
+      <w:proofErr w:type="gramStart"/>
       <w:r>
         <w:rPr>
           <w:sz w:val="28"/>
           <w:szCs w:val="28"/>
           <w:lang w:val="en-US"/>
         </w:rPr>
-        <w:t>.github</w:t>
-      </w:r>
+        <w:t>.</w:t>
+      </w:r>
+      <w:proofErr w:type="spellStart"/>
       <w:r>
         <w:rPr>
           <w:sz w:val="28"/>
           <w:szCs w:val="28"/>
           <w:lang w:val="en-US"/>
         </w:rPr>
-        <w:tab/>
-      </w:r>
+        <w:t>github</w:t>
+      </w:r>
+      <w:proofErr w:type="spellEnd"/>
+      <w:proofErr w:type="gramEnd"/>
       <w:r>
         <w:rPr>
           <w:sz w:val="28"/>
@@ -2264,31 +2663,32 @@
         </w:rPr>
         <w:tab/>
       </w:r>
-    </w:p>
-    <w:p>
-      <w:pPr>
-        <w:pStyle w:val="Sinespaciado"/>
+      <w:r>
         <w:rPr>
           <w:sz w:val="28"/>
           <w:szCs w:val="28"/>
           <w:lang w:val="en-US"/>
         </w:rPr>
-      </w:pPr>
-      <w:r>
+        <w:tab/>
+      </w:r>
+    </w:p>
+    <w:p>
+      <w:pPr>
+        <w:pStyle w:val="Sinespaciado"/>
         <w:rPr>
           <w:sz w:val="28"/>
           <w:szCs w:val="28"/>
           <w:lang w:val="en-US"/>
         </w:rPr>
-        <w:t>d</w:t>
-      </w:r>
+      </w:pPr>
+      <w:proofErr w:type="spellStart"/>
       <w:r>
         <w:rPr>
           <w:sz w:val="28"/>
           <w:szCs w:val="28"/>
           <w:lang w:val="en-US"/>
         </w:rPr>
-        <w:t>ist</w:t>
+        <w:t>d</w:t>
       </w:r>
       <w:r>
         <w:rPr>
@@ -2296,8 +2696,9 @@
           <w:szCs w:val="28"/>
           <w:lang w:val="en-US"/>
         </w:rPr>
-        <w:tab/>
-      </w:r>
+        <w:t>ist</w:t>
+      </w:r>
+      <w:proofErr w:type="spellEnd"/>
       <w:r>
         <w:rPr>
           <w:sz w:val="28"/>
@@ -2314,31 +2715,31 @@
         </w:rPr>
         <w:tab/>
       </w:r>
-    </w:p>
-    <w:p>
-      <w:pPr>
-        <w:pStyle w:val="Sinespaciado"/>
+      <w:r>
         <w:rPr>
           <w:sz w:val="28"/>
           <w:szCs w:val="28"/>
           <w:lang w:val="en-US"/>
         </w:rPr>
-      </w:pPr>
-      <w:r>
+        <w:tab/>
+      </w:r>
+    </w:p>
+    <w:p>
+      <w:pPr>
+        <w:pStyle w:val="Sinespaciado"/>
         <w:rPr>
           <w:sz w:val="28"/>
           <w:szCs w:val="28"/>
           <w:lang w:val="en-US"/>
         </w:rPr>
-        <w:t>B</w:t>
-      </w:r>
+      </w:pPr>
       <w:r>
         <w:rPr>
           <w:sz w:val="28"/>
           <w:szCs w:val="28"/>
           <w:lang w:val="en-US"/>
         </w:rPr>
-        <w:t>uild</w:t>
+        <w:t>B</w:t>
       </w:r>
       <w:r>
         <w:rPr>
@@ -2346,7 +2747,7 @@
           <w:szCs w:val="28"/>
           <w:lang w:val="en-US"/>
         </w:rPr>
-        <w:tab/>
+        <w:t>uild</w:t>
       </w:r>
       <w:r>
         <w:rPr>
@@ -2364,50 +2765,52 @@
         </w:rPr>
         <w:tab/>
       </w:r>
-    </w:p>
-    <w:p>
-      <w:pPr>
-        <w:pStyle w:val="Sinespaciado"/>
+      <w:r>
         <w:rPr>
           <w:sz w:val="28"/>
           <w:szCs w:val="28"/>
           <w:lang w:val="en-US"/>
         </w:rPr>
-      </w:pPr>
-      <w:r>
+        <w:tab/>
+      </w:r>
+    </w:p>
+    <w:p>
+      <w:pPr>
+        <w:pStyle w:val="Sinespaciado"/>
         <w:rPr>
           <w:sz w:val="28"/>
           <w:szCs w:val="28"/>
           <w:lang w:val="en-US"/>
         </w:rPr>
-        <w:t>.env</w:t>
-      </w:r>
+      </w:pPr>
+      <w:proofErr w:type="gramStart"/>
       <w:r>
         <w:rPr>
           <w:sz w:val="28"/>
           <w:szCs w:val="28"/>
           <w:lang w:val="en-US"/>
         </w:rPr>
-        <w:tab/>
-      </w:r>
-    </w:p>
-    <w:p>
-      <w:pPr>
-        <w:pStyle w:val="Sinespaciado"/>
+        <w:t>.env</w:t>
+      </w:r>
+      <w:proofErr w:type="gramEnd"/>
+      <w:r>
         <w:rPr>
           <w:sz w:val="28"/>
           <w:szCs w:val="28"/>
           <w:lang w:val="en-US"/>
         </w:rPr>
-      </w:pPr>
-      <w:r>
+        <w:tab/>
+      </w:r>
+    </w:p>
+    <w:p>
+      <w:pPr>
+        <w:pStyle w:val="Sinespaciado"/>
         <w:rPr>
           <w:sz w:val="28"/>
           <w:szCs w:val="28"/>
           <w:lang w:val="en-US"/>
         </w:rPr>
-        <w:tab/>
-      </w:r>
+      </w:pPr>
       <w:r>
         <w:rPr>
           <w:sz w:val="28"/>
@@ -2416,6 +2819,14 @@
         </w:rPr>
         <w:tab/>
       </w:r>
+      <w:r>
+        <w:rPr>
+          <w:sz w:val="28"/>
+          <w:szCs w:val="28"/>
+          <w:lang w:val="en-US"/>
+        </w:rPr>
+        <w:tab/>
+      </w:r>
     </w:p>
     <w:p>
       <w:pPr>
@@ -2454,11 +2865,12 @@
     <w:p>
       <w:pPr>
         <w:pStyle w:val="Ttulo2"/>
-        <w:rPr>
-          <w:lang w:val="en-US"/>
-        </w:rPr>
-      </w:pPr>
-      <w:bookmarkStart w:id="6" w:name="_Toc230097272"/>
+        <w:ind w:left="708" w:hanging="708"/>
+        <w:rPr>
+          <w:lang w:val="en-US"/>
+        </w:rPr>
+      </w:pPr>
+      <w:bookmarkStart w:id="6" w:name="_Toc230533612"/>
       <w:r>
         <w:rPr>
           <w:lang w:val="en-US"/>
@@ -2466,13 +2878,13 @@
         <w:lastRenderedPageBreak/>
         <w:t>Azure</w:t>
       </w:r>
+      <w:r>
+        <w:rPr>
+          <w:lang w:val="en-US"/>
+        </w:rPr>
+        <w:t xml:space="preserve"> Cloud</w:t>
+      </w:r>
       <w:bookmarkEnd w:id="6"/>
-      <w:r>
-        <w:rPr>
-          <w:lang w:val="en-US"/>
-        </w:rPr>
-        <w:t xml:space="preserve"> Cloude</w:t>
-      </w:r>
     </w:p>
     <w:p>
       <w:pPr>
@@ -2492,12 +2904,14 @@
         </w:rPr>
         <w:t>“</w:t>
       </w:r>
+      <w:proofErr w:type="spellStart"/>
       <w:r>
         <w:rPr>
           <w:lang w:val="en-US"/>
         </w:rPr>
         <w:t>PersonalProjects</w:t>
       </w:r>
+      <w:proofErr w:type="spellEnd"/>
       <w:r>
         <w:rPr>
           <w:lang w:val="en-US"/>
@@ -2569,7 +2983,21 @@
         <w:rPr>
           <w:lang w:val="en-US"/>
         </w:rPr>
-        <w:t>Created resource group rg-portfolio-prod</w:t>
+        <w:t xml:space="preserve">Created resource group </w:t>
+      </w:r>
+      <w:proofErr w:type="spellStart"/>
+      <w:r>
+        <w:rPr>
+          <w:lang w:val="en-US"/>
+        </w:rPr>
+        <w:t>rg</w:t>
+      </w:r>
+      <w:proofErr w:type="spellEnd"/>
+      <w:r>
+        <w:rPr>
+          <w:lang w:val="en-US"/>
+        </w:rPr>
+        <w:t>-portfolio-prod</w:t>
       </w:r>
       <w:r>
         <w:rPr>
@@ -2738,13 +3166,13 @@
         <w:rPr>
           <w:lang w:val="en-US"/>
         </w:rPr>
-        <w:t>low</w:t>
-      </w:r>
-      <w:r>
-        <w:rPr>
-          <w:lang w:val="en-US"/>
-        </w:rPr>
-        <w:t xml:space="preserve"> cost website</w:t>
+        <w:t>low-cost</w:t>
+      </w:r>
+      <w:r>
+        <w:rPr>
+          <w:lang w:val="en-US"/>
+        </w:rPr>
+        <w:t xml:space="preserve"> website</w:t>
       </w:r>
       <w:r>
         <w:rPr>
@@ -2872,7 +3300,35 @@
         <w:rPr>
           <w:lang w:val="en-US"/>
         </w:rPr>
-        <w:t xml:space="preserve"> It currently contains an ngix placeholder while we configure our container.</w:t>
+        <w:t xml:space="preserve"> It currently contains </w:t>
+      </w:r>
+      <w:proofErr w:type="gramStart"/>
+      <w:r>
+        <w:rPr>
+          <w:lang w:val="en-US"/>
+        </w:rPr>
+        <w:t>an</w:t>
+      </w:r>
+      <w:proofErr w:type="gramEnd"/>
+      <w:r>
+        <w:rPr>
+          <w:lang w:val="en-US"/>
+        </w:rPr>
+        <w:t xml:space="preserve"> </w:t>
+      </w:r>
+      <w:proofErr w:type="spellStart"/>
+      <w:r>
+        <w:rPr>
+          <w:lang w:val="en-US"/>
+        </w:rPr>
+        <w:t>ngix</w:t>
+      </w:r>
+      <w:proofErr w:type="spellEnd"/>
+      <w:r>
+        <w:rPr>
+          <w:lang w:val="en-US"/>
+        </w:rPr>
+        <w:t xml:space="preserve"> placeholder while we configure our container.</w:t>
       </w:r>
     </w:p>
     <w:p>
@@ -2933,7 +3389,19 @@
         <w:rPr>
           <w:lang w:val="en-US"/>
         </w:rPr>
-        <w:t xml:space="preserve">Added custom domain linked to GoDaddy purchased domain juanjosecastroz.com. The domain is binded to an </w:t>
+        <w:t xml:space="preserve">Added custom domain linked to GoDaddy purchased domain juanjosecastroz.com. The domain is </w:t>
+      </w:r>
+      <w:r>
+        <w:rPr>
+          <w:lang w:val="en-US"/>
+        </w:rPr>
+        <w:t>bound</w:t>
+      </w:r>
+      <w:r>
+        <w:rPr>
+          <w:lang w:val="en-US"/>
+        </w:rPr>
+        <w:t xml:space="preserve"> to an </w:t>
       </w:r>
       <w:r>
         <w:rPr>
@@ -3009,18 +3477,11 @@
           </wp:inline>
         </w:drawing>
       </w:r>
-    </w:p>
-    <w:p>
-      <w:pPr>
-        <w:rPr>
-          <w:lang w:val="en-US"/>
-        </w:rPr>
-      </w:pPr>
-      <w:r>
-        <w:rPr>
-          <w:lang w:val="en-US"/>
-        </w:rPr>
-        <w:t xml:space="preserve">Once </w:t>
+      <w:r>
+        <w:rPr>
+          <w:lang w:val="en-US"/>
+        </w:rPr>
+        <w:t xml:space="preserve"> </w:t>
       </w:r>
     </w:p>
     <w:p>
@@ -3047,17 +3508,54 @@
           <w:lang w:val="en-US"/>
         </w:rPr>
         <w:lastRenderedPageBreak/>
-        <w:t>Added a static we app connecting my current GitHub repository using the free plan  and taking branch main as production.</w:t>
-      </w:r>
-    </w:p>
-    <w:p>
-      <w:pPr>
-        <w:rPr>
-          <w:lang w:val="en-US"/>
-        </w:rPr>
-      </w:pPr>
-      <w:r>
-        <w:rPr>
+        <w:t xml:space="preserve">Added a static we app connecting my current GitHub repository using the free </w:t>
+      </w:r>
+      <w:r>
+        <w:rPr>
+          <w:lang w:val="en-US"/>
+        </w:rPr>
+        <w:t>plan and</w:t>
+      </w:r>
+      <w:r>
+        <w:rPr>
+          <w:lang w:val="en-US"/>
+        </w:rPr>
+        <w:t xml:space="preserve"> taking branch </w:t>
+      </w:r>
+      <w:r>
+        <w:rPr>
+          <w:lang w:val="en-US"/>
+        </w:rPr>
+        <w:t>“</w:t>
+      </w:r>
+      <w:r>
+        <w:rPr>
+          <w:lang w:val="en-US"/>
+        </w:rPr>
+        <w:t>main</w:t>
+      </w:r>
+      <w:r>
+        <w:rPr>
+          <w:lang w:val="en-US"/>
+        </w:rPr>
+        <w:t>”</w:t>
+      </w:r>
+      <w:r>
+        <w:rPr>
+          <w:lang w:val="en-US"/>
+        </w:rPr>
+        <w:t xml:space="preserve"> as production.</w:t>
+      </w:r>
+    </w:p>
+    <w:p>
+      <w:pPr>
+        <w:rPr>
+          <w:lang w:val="en-US"/>
+        </w:rPr>
+      </w:pPr>
+      <w:r>
+        <w:rPr>
+          <w:noProof/>
           <w:lang w:val="en-US"/>
         </w:rPr>
         <w:drawing>
@@ -3095,6 +3593,398 @@
             </a:graphic>
           </wp:inline>
         </w:drawing>
+      </w:r>
+    </w:p>
+    <w:p>
+      <w:pPr>
+        <w:rPr>
+          <w:lang w:val="en-US"/>
+        </w:rPr>
+      </w:pPr>
+    </w:p>
+    <w:p>
+      <w:pPr>
+        <w:rPr>
+          <w:lang w:val="en-US"/>
+        </w:rPr>
+      </w:pPr>
+    </w:p>
+    <w:p>
+      <w:pPr>
+        <w:rPr>
+          <w:lang w:val="en-US"/>
+        </w:rPr>
+      </w:pPr>
+    </w:p>
+    <w:p>
+      <w:pPr>
+        <w:rPr>
+          <w:lang w:val="en-US"/>
+        </w:rPr>
+      </w:pPr>
+    </w:p>
+    <w:p>
+      <w:pPr>
+        <w:pStyle w:val="Ttulo2"/>
+        <w:rPr>
+          <w:lang w:val="en-US"/>
+        </w:rPr>
+      </w:pPr>
+      <w:bookmarkStart w:id="7" w:name="_Toc230533613"/>
+      <w:r>
+        <w:rPr>
+          <w:lang w:val="en-US"/>
+        </w:rPr>
+        <w:lastRenderedPageBreak/>
+        <w:t>GitHub Actions</w:t>
+      </w:r>
+      <w:bookmarkEnd w:id="7"/>
+    </w:p>
+    <w:p>
+      <w:pPr>
+        <w:rPr>
+          <w:lang w:val="en-US"/>
+        </w:rPr>
+      </w:pPr>
+      <w:r>
+        <w:rPr>
+          <w:lang w:val="en-US"/>
+        </w:rPr>
+        <w:t>The deployment workflow of this portfolio is entirely automated using GitHub Actions. By implementing a custom continuous integration and continuous deployment configuration fil</w:t>
+      </w:r>
+      <w:r>
+        <w:rPr>
+          <w:lang w:val="en-US"/>
+        </w:rPr>
+        <w:t>e,</w:t>
+      </w:r>
+      <w:r>
+        <w:rPr>
+          <w:lang w:val="en-US"/>
+        </w:rPr>
+        <w:t xml:space="preserve"> the manual process of building and deploying the application was </w:t>
+      </w:r>
+      <w:r>
+        <w:rPr>
+          <w:lang w:val="en-US"/>
+        </w:rPr>
+        <w:t>eliminated</w:t>
+      </w:r>
+      <w:r>
+        <w:rPr>
+          <w:lang w:val="en-US"/>
+        </w:rPr>
+        <w:t>.</w:t>
+      </w:r>
+    </w:p>
+    <w:p>
+      <w:pPr>
+        <w:rPr>
+          <w:lang w:val="en-US"/>
+        </w:rPr>
+      </w:pPr>
+      <w:r>
+        <w:rPr>
+          <w:noProof/>
+          <w:lang w:val="en-US"/>
+        </w:rPr>
+        <w:drawing>
+          <wp:inline distT="0" distB="0" distL="0" distR="0" wp14:anchorId="25CFE942" wp14:editId="34345B2D">
+            <wp:extent cx="3029373" cy="390580"/>
+            <wp:effectExtent l="0" t="0" r="0" b="9525"/>
+            <wp:docPr id="672804091" name="Imagen 1"/>
+            <wp:cNvGraphicFramePr>
+              <a:graphicFrameLocks xmlns:a="http://schemas.openxmlformats.org/drawingml/2006/main" noChangeAspect="1"/>
+            </wp:cNvGraphicFramePr>
+            <a:graphic xmlns:a="http://schemas.openxmlformats.org/drawingml/2006/main">
+              <a:graphicData uri="http://schemas.openxmlformats.org/drawingml/2006/picture">
+                <pic:pic xmlns:pic="http://schemas.openxmlformats.org/drawingml/2006/picture">
+                  <pic:nvPicPr>
+                    <pic:cNvPr id="672804091" name=""/>
+                    <pic:cNvPicPr/>
+                  </pic:nvPicPr>
+                  <pic:blipFill>
+                    <a:blip r:embed="rId17"/>
+                    <a:stretch>
+                      <a:fillRect/>
+                    </a:stretch>
+                  </pic:blipFill>
+                  <pic:spPr>
+                    <a:xfrm>
+                      <a:off x="0" y="0"/>
+                      <a:ext cx="3029373" cy="390580"/>
+                    </a:xfrm>
+                    <a:prstGeom prst="rect">
+                      <a:avLst/>
+                    </a:prstGeom>
+                  </pic:spPr>
+                </pic:pic>
+              </a:graphicData>
+            </a:graphic>
+          </wp:inline>
+        </w:drawing>
+      </w:r>
+    </w:p>
+    <w:p>
+      <w:pPr>
+        <w:rPr>
+          <w:lang w:val="en-US"/>
+        </w:rPr>
+      </w:pPr>
+    </w:p>
+    <w:p>
+      <w:pPr>
+        <w:rPr>
+          <w:lang w:val="en-US"/>
+        </w:rPr>
+      </w:pPr>
+      <w:r>
+        <w:rPr>
+          <w:lang w:val="en-US"/>
+        </w:rPr>
+        <w:t>The workflow operates through three core steps:</w:t>
+      </w:r>
+    </w:p>
+    <w:p>
+      <w:pPr>
+        <w:rPr>
+          <w:lang w:val="en-US"/>
+        </w:rPr>
+      </w:pPr>
+      <w:r>
+        <w:rPr>
+          <w:lang w:val="en-US"/>
+        </w:rPr>
+        <w:t>Trigger: Every time a new commit is pushed to the main branch</w:t>
+      </w:r>
+      <w:r>
+        <w:rPr>
+          <w:lang w:val="en-US"/>
+        </w:rPr>
+        <w:t xml:space="preserve">. </w:t>
+      </w:r>
+      <w:r>
+        <w:rPr>
+          <w:lang w:val="en-US"/>
+        </w:rPr>
+        <w:t xml:space="preserve">GitHub automatically detects the change and triggers the </w:t>
+      </w:r>
+      <w:r>
+        <w:rPr>
+          <w:lang w:val="en-US"/>
+        </w:rPr>
+        <w:t>action</w:t>
+      </w:r>
+      <w:r>
+        <w:rPr>
+          <w:lang w:val="en-US"/>
+        </w:rPr>
+        <w:t>.</w:t>
+      </w:r>
+    </w:p>
+    <w:p>
+      <w:pPr>
+        <w:rPr>
+          <w:lang w:val="en-US"/>
+        </w:rPr>
+      </w:pPr>
+    </w:p>
+    <w:p>
+      <w:pPr>
+        <w:rPr>
+          <w:lang w:val="en-US"/>
+        </w:rPr>
+      </w:pPr>
+      <w:r>
+        <w:rPr>
+          <w:lang w:val="en-US"/>
+        </w:rPr>
+        <w:t>Build</w:t>
+      </w:r>
+      <w:r>
+        <w:rPr>
+          <w:lang w:val="en-US"/>
+        </w:rPr>
+        <w:t>ing</w:t>
+      </w:r>
+      <w:r>
+        <w:rPr>
+          <w:lang w:val="en-US"/>
+        </w:rPr>
+        <w:t xml:space="preserve"> </w:t>
+      </w:r>
+      <w:r>
+        <w:rPr>
+          <w:lang w:val="en-US"/>
+        </w:rPr>
+        <w:t>p</w:t>
+      </w:r>
+      <w:r>
+        <w:rPr>
+          <w:lang w:val="en-US"/>
+        </w:rPr>
+        <w:t xml:space="preserve">rocess: GitHub </w:t>
+      </w:r>
+      <w:r>
+        <w:rPr>
+          <w:lang w:val="en-US"/>
+        </w:rPr>
+        <w:t>provides</w:t>
+      </w:r>
+      <w:r>
+        <w:rPr>
+          <w:lang w:val="en-US"/>
+        </w:rPr>
+        <w:t xml:space="preserve"> a clean, temporary Linux virtual machine. It checks out the latest code version, installs the necessary dependencies, and executes Vite's optimized production build engine</w:t>
+      </w:r>
+      <w:r>
+        <w:rPr>
+          <w:lang w:val="en-US"/>
+        </w:rPr>
+        <w:t xml:space="preserve">. </w:t>
+      </w:r>
+      <w:r>
+        <w:rPr>
+          <w:lang w:val="en-US"/>
+        </w:rPr>
+        <w:t xml:space="preserve">This compiles the source React code into </w:t>
+      </w:r>
+      <w:r>
+        <w:rPr>
+          <w:lang w:val="en-US"/>
+        </w:rPr>
+        <w:t>a</w:t>
+      </w:r>
+      <w:r>
+        <w:rPr>
+          <w:lang w:val="en-US"/>
+        </w:rPr>
+        <w:t xml:space="preserve"> static asset stored in the /</w:t>
+      </w:r>
+      <w:proofErr w:type="spellStart"/>
+      <w:r>
+        <w:rPr>
+          <w:lang w:val="en-US"/>
+        </w:rPr>
+        <w:t>dist</w:t>
+      </w:r>
+      <w:proofErr w:type="spellEnd"/>
+      <w:r>
+        <w:rPr>
+          <w:lang w:val="en-US"/>
+        </w:rPr>
+        <w:t xml:space="preserve"> directory.</w:t>
+      </w:r>
+    </w:p>
+    <w:p>
+      <w:pPr>
+        <w:rPr>
+          <w:lang w:val="en-US"/>
+        </w:rPr>
+      </w:pPr>
+    </w:p>
+    <w:p>
+      <w:pPr>
+        <w:rPr>
+          <w:lang w:val="en-US"/>
+        </w:rPr>
+      </w:pPr>
+      <w:r>
+        <w:rPr>
+          <w:lang w:val="en-US"/>
+        </w:rPr>
+        <w:lastRenderedPageBreak/>
+        <w:t>The Deployment: Using Microsoft’s official Static Web Apps deployment action, the pipeline securely uploads the compiled /</w:t>
+      </w:r>
+      <w:proofErr w:type="spellStart"/>
+      <w:r>
+        <w:rPr>
+          <w:lang w:val="en-US"/>
+        </w:rPr>
+        <w:t>dist</w:t>
+      </w:r>
+      <w:proofErr w:type="spellEnd"/>
+      <w:r>
+        <w:rPr>
+          <w:lang w:val="en-US"/>
+        </w:rPr>
+        <w:t xml:space="preserve"> folder directly to Azure’s </w:t>
+      </w:r>
+      <w:r>
+        <w:rPr>
+          <w:lang w:val="en-US"/>
+        </w:rPr>
+        <w:t>CDN.</w:t>
+      </w:r>
+    </w:p>
+    <w:p>
+      <w:pPr>
+        <w:rPr>
+          <w:lang w:val="en-US"/>
+        </w:rPr>
+      </w:pPr>
+    </w:p>
+    <w:p>
+      <w:pPr>
+        <w:rPr>
+          <w:lang w:val="en-US"/>
+        </w:rPr>
+      </w:pPr>
+      <w:r>
+        <w:rPr>
+          <w:lang w:val="en-US"/>
+        </w:rPr>
+        <w:t>In addition</w:t>
+      </w:r>
+      <w:r>
+        <w:rPr>
+          <w:lang w:val="en-US"/>
+        </w:rPr>
+        <w:t xml:space="preserve">, the workflow configuration includes an explicit </w:t>
+      </w:r>
+      <w:r>
+        <w:rPr>
+          <w:lang w:val="en-US"/>
+        </w:rPr>
+        <w:t>“</w:t>
+      </w:r>
+      <w:proofErr w:type="spellStart"/>
+      <w:r>
+        <w:rPr>
+          <w:lang w:val="en-US"/>
+        </w:rPr>
+        <w:t>skip_api_build</w:t>
+      </w:r>
+      <w:proofErr w:type="spellEnd"/>
+      <w:r>
+        <w:rPr>
+          <w:lang w:val="en-US"/>
+        </w:rPr>
+        <w:t>: true</w:t>
+      </w:r>
+      <w:r>
+        <w:rPr>
+          <w:lang w:val="en-US"/>
+        </w:rPr>
+        <w:t>” indication</w:t>
+      </w:r>
+      <w:r>
+        <w:rPr>
+          <w:lang w:val="en-US"/>
+        </w:rPr>
+        <w:t xml:space="preserve">. This prevents the deployment engine from scanning for backend components, </w:t>
+      </w:r>
+      <w:r>
+        <w:rPr>
+          <w:lang w:val="en-US"/>
+        </w:rPr>
+        <w:t xml:space="preserve">optimizing </w:t>
+      </w:r>
+      <w:r>
+        <w:rPr>
+          <w:lang w:val="en-US"/>
+        </w:rPr>
+        <w:t>build speeds down to just a few seconds.</w:t>
       </w:r>
     </w:p>
     <w:sectPr>

</xml_diff>

<commit_message>
Added Documentation component and link to it in App.jsx. Updated Hero.jsx to add a background image and a dark overlay for better text visibility.
</commit_message>
<xml_diff>
--- a/Documentation/Personal Web Portfolio Documentation.docx
+++ b/Documentation/Personal Web Portfolio Documentation.docx
@@ -233,22 +233,21 @@
       </w:pPr>
       <w:r>
         <w:rPr>
-          <w:noProof/>
           <w:lang w:val="en-US"/>
         </w:rPr>
         <w:drawing>
-          <wp:anchor distT="0" distB="0" distL="114300" distR="114300" simplePos="0" relativeHeight="251658240" behindDoc="0" locked="0" layoutInCell="1" allowOverlap="1" wp14:anchorId="69219F7A" wp14:editId="5A1E3975">
+          <wp:anchor distT="0" distB="0" distL="114300" distR="114300" simplePos="0" relativeHeight="251661312" behindDoc="0" locked="0" layoutInCell="1" allowOverlap="1" wp14:anchorId="326C0555" wp14:editId="2B0F47EC">
             <wp:simplePos x="0" y="0"/>
             <wp:positionH relativeFrom="margin">
-              <wp:posOffset>771525</wp:posOffset>
+              <wp:align>center</wp:align>
             </wp:positionH>
             <wp:positionV relativeFrom="paragraph">
-              <wp:posOffset>197749</wp:posOffset>
+              <wp:posOffset>314242</wp:posOffset>
             </wp:positionV>
-            <wp:extent cx="4037610" cy="3157368"/>
-            <wp:effectExtent l="0" t="0" r="1270" b="5080"/>
+            <wp:extent cx="3633746" cy="2822547"/>
+            <wp:effectExtent l="0" t="0" r="5080" b="0"/>
             <wp:wrapNone/>
-            <wp:docPr id="1137005222" name="Imagen 1"/>
+            <wp:docPr id="1139308094" name="Imagen 1"/>
             <wp:cNvGraphicFramePr>
               <a:graphicFrameLocks xmlns:a="http://schemas.openxmlformats.org/drawingml/2006/main" noChangeAspect="1"/>
             </wp:cNvGraphicFramePr>
@@ -256,10 +255,10 @@
               <a:graphicData uri="http://schemas.openxmlformats.org/drawingml/2006/picture">
                 <pic:pic xmlns:pic="http://schemas.openxmlformats.org/drawingml/2006/picture">
                   <pic:nvPicPr>
-                    <pic:cNvPr id="1137005222" name=""/>
+                    <pic:cNvPr id="1139308094" name=""/>
                     <pic:cNvPicPr/>
                   </pic:nvPicPr>
-                  <pic:blipFill rotWithShape="1">
+                  <pic:blipFill>
                     <a:blip r:embed="rId5" cstate="print">
                       <a:extLst>
                         <a:ext uri="{28A0092B-C50C-407E-A947-70E740481C1C}">
@@ -267,27 +266,18 @@
                         </a:ext>
                       </a:extLst>
                     </a:blip>
-                    <a:srcRect l="19518" t="9971" r="21937" b="-1"/>
                     <a:stretch>
                       <a:fillRect/>
                     </a:stretch>
                   </pic:blipFill>
-                  <pic:spPr bwMode="auto">
+                  <pic:spPr>
                     <a:xfrm>
                       <a:off x="0" y="0"/>
-                      <a:ext cx="4037610" cy="3157368"/>
+                      <a:ext cx="3633746" cy="2822547"/>
                     </a:xfrm>
                     <a:prstGeom prst="rect">
                       <a:avLst/>
                     </a:prstGeom>
-                    <a:ln>
-                      <a:noFill/>
-                    </a:ln>
-                    <a:extLst>
-                      <a:ext uri="{53640926-AAD7-44D8-BBD7-CCE9431645EC}">
-                        <a14:shadowObscured xmlns:a14="http://schemas.microsoft.com/office/drawing/2010/main"/>
-                      </a:ext>
-                    </a:extLst>
                   </pic:spPr>
                 </pic:pic>
               </a:graphicData>
@@ -358,7 +348,7 @@
         </w:rPr>
         <w:fldChar w:fldCharType="separate"/>
       </w:r>
-      <w:hyperlink w:anchor="_Toc230097266" w:history="1">
+      <w:hyperlink w:anchor="_Toc230527813" w:history="1">
         <w:r>
           <w:rPr>
             <w:rStyle w:val="Hipervnculo"/>
@@ -386,7 +376,7 @@
             <w:noProof/>
             <w:webHidden/>
           </w:rPr>
-          <w:instrText xml:space="preserve"> PAGEREF _Toc230097266 \h </w:instrText>
+          <w:instrText xml:space="preserve"> PAGEREF _Toc230527813 \h </w:instrText>
         </w:r>
         <w:r>
           <w:rPr>
@@ -432,7 +422,7 @@
           <w:szCs w:val="24"/>
         </w:rPr>
       </w:pPr>
-      <w:hyperlink w:anchor="_Toc230097267" w:history="1">
+      <w:hyperlink w:anchor="_Toc230527814" w:history="1">
         <w:r>
           <w:rPr>
             <w:rStyle w:val="Hipervnculo"/>
@@ -460,7 +450,7 @@
             <w:noProof/>
             <w:webHidden/>
           </w:rPr>
-          <w:instrText xml:space="preserve"> PAGEREF _Toc230097267 \h </w:instrText>
+          <w:instrText xml:space="preserve"> PAGEREF _Toc230527814 \h </w:instrText>
         </w:r>
         <w:r>
           <w:rPr>
@@ -506,7 +496,7 @@
           <w:szCs w:val="24"/>
         </w:rPr>
       </w:pPr>
-      <w:hyperlink w:anchor="_Toc230097268" w:history="1">
+      <w:hyperlink w:anchor="_Toc230527815" w:history="1">
         <w:r>
           <w:rPr>
             <w:rStyle w:val="Hipervnculo"/>
@@ -534,7 +524,7 @@
             <w:noProof/>
             <w:webHidden/>
           </w:rPr>
-          <w:instrText xml:space="preserve"> PAGEREF _Toc230097268 \h </w:instrText>
+          <w:instrText xml:space="preserve"> PAGEREF _Toc230527815 \h </w:instrText>
         </w:r>
         <w:r>
           <w:rPr>
@@ -580,7 +570,7 @@
           <w:szCs w:val="24"/>
         </w:rPr>
       </w:pPr>
-      <w:hyperlink w:anchor="_Toc230097269" w:history="1">
+      <w:hyperlink w:anchor="_Toc230527816" w:history="1">
         <w:r>
           <w:rPr>
             <w:rStyle w:val="Hipervnculo"/>
@@ -608,7 +598,7 @@
             <w:noProof/>
             <w:webHidden/>
           </w:rPr>
-          <w:instrText xml:space="preserve"> PAGEREF _Toc230097269 \h </w:instrText>
+          <w:instrText xml:space="preserve"> PAGEREF _Toc230527816 \h </w:instrText>
         </w:r>
         <w:r>
           <w:rPr>
@@ -655,7 +645,7 @@
           <w:u w:val="none"/>
         </w:rPr>
       </w:pPr>
-      <w:hyperlink w:anchor="_Toc230097270" w:history="1">
+      <w:hyperlink w:anchor="_Toc230527817" w:history="1">
         <w:r>
           <w:rPr>
             <w:rStyle w:val="Hipervnculo"/>
@@ -683,7 +673,7 @@
             <w:noProof/>
             <w:webHidden/>
           </w:rPr>
-          <w:instrText xml:space="preserve"> PAGEREF _Toc230097270 \h </w:instrText>
+          <w:instrText xml:space="preserve"> PAGEREF _Toc230527817 \h </w:instrText>
         </w:r>
         <w:r>
           <w:rPr>
@@ -729,7 +719,7 @@
           <w:szCs w:val="24"/>
         </w:rPr>
       </w:pPr>
-      <w:hyperlink w:anchor="_Toc230097271" w:history="1">
+      <w:hyperlink w:anchor="_Toc230527818" w:history="1">
         <w:r>
           <w:rPr>
             <w:rStyle w:val="Hipervnculo"/>
@@ -757,7 +747,7 @@
             <w:noProof/>
             <w:webHidden/>
           </w:rPr>
-          <w:instrText xml:space="preserve"> PAGEREF _Toc230097271 \h </w:instrText>
+          <w:instrText xml:space="preserve"> PAGEREF _Toc230527818 \h </w:instrText>
         </w:r>
         <w:r>
           <w:rPr>
@@ -803,14 +793,14 @@
           <w:szCs w:val="24"/>
         </w:rPr>
       </w:pPr>
-      <w:hyperlink w:anchor="_Toc230097272" w:history="1">
+      <w:hyperlink w:anchor="_Toc230527819" w:history="1">
         <w:r>
           <w:rPr>
             <w:rStyle w:val="Hipervnculo"/>
             <w:noProof/>
             <w:lang w:val="en-US"/>
           </w:rPr>
-          <w:t>Azure</w:t>
+          <w:t>Azure Cloude</w:t>
         </w:r>
         <w:r>
           <w:rPr>
@@ -831,7 +821,7 @@
             <w:noProof/>
             <w:webHidden/>
           </w:rPr>
-          <w:instrText xml:space="preserve"> PAGEREF _Toc230097272 \h </w:instrText>
+          <w:instrText xml:space="preserve"> PAGEREF _Toc230527819 \h </w:instrText>
         </w:r>
         <w:r>
           <w:rPr>
@@ -852,6 +842,80 @@
             <w:webHidden/>
           </w:rPr>
           <w:t>7</w:t>
+        </w:r>
+        <w:r>
+          <w:rPr>
+            <w:noProof/>
+            <w:webHidden/>
+          </w:rPr>
+          <w:fldChar w:fldCharType="end"/>
+        </w:r>
+      </w:hyperlink>
+    </w:p>
+    <w:p>
+      <w:pPr>
+        <w:pStyle w:val="TDC2"/>
+        <w:tabs>
+          <w:tab w:val="right" w:leader="underscore" w:pos="8828"/>
+        </w:tabs>
+        <w:rPr>
+          <w:b w:val="0"/>
+          <w:bCs w:val="0"/>
+          <w:smallCaps w:val="0"/>
+          <w:noProof/>
+          <w:sz w:val="24"/>
+          <w:szCs w:val="24"/>
+        </w:rPr>
+      </w:pPr>
+      <w:hyperlink w:anchor="_Toc230527820" w:history="1">
+        <w:r>
+          <w:rPr>
+            <w:rStyle w:val="Hipervnculo"/>
+            <w:noProof/>
+            <w:lang w:val="en-US"/>
+          </w:rPr>
+          <w:t>GitHub Actions</w:t>
+        </w:r>
+        <w:r>
+          <w:rPr>
+            <w:noProof/>
+            <w:webHidden/>
+          </w:rPr>
+          <w:tab/>
+        </w:r>
+        <w:r>
+          <w:rPr>
+            <w:noProof/>
+            <w:webHidden/>
+          </w:rPr>
+          <w:fldChar w:fldCharType="begin"/>
+        </w:r>
+        <w:r>
+          <w:rPr>
+            <w:noProof/>
+            <w:webHidden/>
+          </w:rPr>
+          <w:instrText xml:space="preserve"> PAGEREF _Toc230527820 \h </w:instrText>
+        </w:r>
+        <w:r>
+          <w:rPr>
+            <w:noProof/>
+            <w:webHidden/>
+          </w:rPr>
+        </w:r>
+        <w:r>
+          <w:rPr>
+            <w:noProof/>
+            <w:webHidden/>
+          </w:rPr>
+          <w:fldChar w:fldCharType="separate"/>
+        </w:r>
+        <w:r>
+          <w:rPr>
+            <w:noProof/>
+            <w:webHidden/>
+          </w:rPr>
+          <w:t>10</w:t>
         </w:r>
         <w:r>
           <w:rPr>
@@ -898,7 +962,7 @@
           <w:lang w:val="en-US"/>
         </w:rPr>
       </w:pPr>
-      <w:bookmarkStart w:id="0" w:name="_Toc230097266"/>
+      <w:bookmarkStart w:id="0" w:name="_Toc230527813"/>
       <w:r>
         <w:rPr>
           <w:color w:val="CC3333"/>
@@ -928,7 +992,7 @@
           <w:lang w:val="en-US"/>
         </w:rPr>
       </w:pPr>
-      <w:bookmarkStart w:id="1" w:name="_Toc230097267"/>
+      <w:bookmarkStart w:id="1" w:name="_Toc230527814"/>
       <w:r>
         <w:rPr>
           <w:rStyle w:val="Ttulo2Car"/>
@@ -997,7 +1061,7 @@
           <w:lang w:val="en-US"/>
         </w:rPr>
       </w:pPr>
-      <w:bookmarkStart w:id="2" w:name="_Toc230097268"/>
+      <w:bookmarkStart w:id="2" w:name="_Toc230527815"/>
       <w:r>
         <w:rPr>
           <w:lang w:val="en-US"/>
@@ -1822,7 +1886,7 @@
           <w:lang w:val="en-US"/>
         </w:rPr>
       </w:pPr>
-      <w:bookmarkStart w:id="3" w:name="_Toc230097269"/>
+      <w:bookmarkStart w:id="3" w:name="_Toc230527816"/>
       <w:r>
         <w:rPr>
           <w:lang w:val="en-US"/>
@@ -1930,14 +1994,13 @@
       </w:pPr>
       <w:r>
         <w:rPr>
-          <w:noProof/>
           <w:lang w:val="en-US"/>
         </w:rPr>
         <w:drawing>
-          <wp:inline distT="0" distB="0" distL="0" distR="0" wp14:anchorId="525ABFFA" wp14:editId="7E83CC62">
-            <wp:extent cx="2819794" cy="6315956"/>
-            <wp:effectExtent l="0" t="0" r="0" b="0"/>
-            <wp:docPr id="677114240" name="Imagen 1"/>
+          <wp:inline distT="0" distB="0" distL="0" distR="0" wp14:anchorId="222D381D" wp14:editId="3F0B60CD">
+            <wp:extent cx="3504491" cy="6162261"/>
+            <wp:effectExtent l="0" t="0" r="1270" b="0"/>
+            <wp:docPr id="739591579" name="Imagen 1"/>
             <wp:cNvGraphicFramePr>
               <a:graphicFrameLocks xmlns:a="http://schemas.openxmlformats.org/drawingml/2006/main" noChangeAspect="1"/>
             </wp:cNvGraphicFramePr>
@@ -1945,7 +2008,7 @@
               <a:graphicData uri="http://schemas.openxmlformats.org/drawingml/2006/picture">
                 <pic:pic xmlns:pic="http://schemas.openxmlformats.org/drawingml/2006/picture">
                   <pic:nvPicPr>
-                    <pic:cNvPr id="677114240" name=""/>
+                    <pic:cNvPr id="739591579" name=""/>
                     <pic:cNvPicPr/>
                   </pic:nvPicPr>
                   <pic:blipFill>
@@ -1957,7 +2020,7 @@
                   <pic:spPr>
                     <a:xfrm>
                       <a:off x="0" y="0"/>
-                      <a:ext cx="2819794" cy="6315956"/>
+                      <a:ext cx="3508022" cy="6168469"/>
                     </a:xfrm>
                     <a:prstGeom prst="rect">
                       <a:avLst/>
@@ -1985,7 +2048,7 @@
           <w:lang w:val="en-US"/>
         </w:rPr>
       </w:pPr>
-      <w:bookmarkStart w:id="4" w:name="_Toc230097270"/>
+      <w:bookmarkStart w:id="4" w:name="_Toc230527817"/>
       <w:r>
         <w:rPr>
           <w:lang w:val="en-US"/>
@@ -2009,7 +2072,7 @@
           <w:lang w:val="en-US"/>
         </w:rPr>
       </w:pPr>
-      <w:bookmarkStart w:id="5" w:name="_Toc230097271"/>
+      <w:bookmarkStart w:id="5" w:name="_Toc230527818"/>
       <w:r>
         <w:rPr>
           <w:lang w:val="en-US"/>
@@ -2458,7 +2521,7 @@
           <w:lang w:val="en-US"/>
         </w:rPr>
       </w:pPr>
-      <w:bookmarkStart w:id="6" w:name="_Toc230097272"/>
+      <w:bookmarkStart w:id="6" w:name="_Toc230527819"/>
       <w:r>
         <w:rPr>
           <w:lang w:val="en-US"/>
@@ -2466,13 +2529,13 @@
         <w:lastRenderedPageBreak/>
         <w:t>Azure</w:t>
       </w:r>
+      <w:r>
+        <w:rPr>
+          <w:lang w:val="en-US"/>
+        </w:rPr>
+        <w:t xml:space="preserve"> Cloude</w:t>
+      </w:r>
       <w:bookmarkEnd w:id="6"/>
-      <w:r>
-        <w:rPr>
-          <w:lang w:val="en-US"/>
-        </w:rPr>
-        <w:t xml:space="preserve"> Cloude</w:t>
-      </w:r>
     </w:p>
     <w:p>
       <w:pPr>
@@ -2738,13 +2801,13 @@
         <w:rPr>
           <w:lang w:val="en-US"/>
         </w:rPr>
-        <w:t>low</w:t>
-      </w:r>
-      <w:r>
-        <w:rPr>
-          <w:lang w:val="en-US"/>
-        </w:rPr>
-        <w:t xml:space="preserve"> cost website</w:t>
+        <w:t>low-cost</w:t>
+      </w:r>
+      <w:r>
+        <w:rPr>
+          <w:lang w:val="en-US"/>
+        </w:rPr>
+        <w:t xml:space="preserve"> website</w:t>
       </w:r>
       <w:r>
         <w:rPr>
@@ -2933,7 +2996,19 @@
         <w:rPr>
           <w:lang w:val="en-US"/>
         </w:rPr>
-        <w:t xml:space="preserve">Added custom domain linked to GoDaddy purchased domain juanjosecastroz.com. The domain is binded to an </w:t>
+        <w:t xml:space="preserve">Added custom domain linked to GoDaddy purchased domain juanjosecastroz.com. The domain is </w:t>
+      </w:r>
+      <w:r>
+        <w:rPr>
+          <w:lang w:val="en-US"/>
+        </w:rPr>
+        <w:t>bound</w:t>
+      </w:r>
+      <w:r>
+        <w:rPr>
+          <w:lang w:val="en-US"/>
+        </w:rPr>
+        <w:t xml:space="preserve"> to an </w:t>
       </w:r>
       <w:r>
         <w:rPr>
@@ -3009,18 +3084,11 @@
           </wp:inline>
         </w:drawing>
       </w:r>
-    </w:p>
-    <w:p>
-      <w:pPr>
-        <w:rPr>
-          <w:lang w:val="en-US"/>
-        </w:rPr>
-      </w:pPr>
-      <w:r>
-        <w:rPr>
-          <w:lang w:val="en-US"/>
-        </w:rPr>
-        <w:t xml:space="preserve">Once </w:t>
+      <w:r>
+        <w:rPr>
+          <w:lang w:val="en-US"/>
+        </w:rPr>
+        <w:t xml:space="preserve"> </w:t>
       </w:r>
     </w:p>
     <w:p>
@@ -3047,17 +3115,54 @@
           <w:lang w:val="en-US"/>
         </w:rPr>
         <w:lastRenderedPageBreak/>
-        <w:t>Added a static we app connecting my current GitHub repository using the free plan  and taking branch main as production.</w:t>
-      </w:r>
-    </w:p>
-    <w:p>
-      <w:pPr>
-        <w:rPr>
-          <w:lang w:val="en-US"/>
-        </w:rPr>
-      </w:pPr>
-      <w:r>
-        <w:rPr>
+        <w:t xml:space="preserve">Added a static we app connecting my current GitHub repository using the free </w:t>
+      </w:r>
+      <w:r>
+        <w:rPr>
+          <w:lang w:val="en-US"/>
+        </w:rPr>
+        <w:t>plan and</w:t>
+      </w:r>
+      <w:r>
+        <w:rPr>
+          <w:lang w:val="en-US"/>
+        </w:rPr>
+        <w:t xml:space="preserve"> taking branch </w:t>
+      </w:r>
+      <w:r>
+        <w:rPr>
+          <w:lang w:val="en-US"/>
+        </w:rPr>
+        <w:t>“</w:t>
+      </w:r>
+      <w:r>
+        <w:rPr>
+          <w:lang w:val="en-US"/>
+        </w:rPr>
+        <w:t>main</w:t>
+      </w:r>
+      <w:r>
+        <w:rPr>
+          <w:lang w:val="en-US"/>
+        </w:rPr>
+        <w:t>”</w:t>
+      </w:r>
+      <w:r>
+        <w:rPr>
+          <w:lang w:val="en-US"/>
+        </w:rPr>
+        <w:t xml:space="preserve"> as production.</w:t>
+      </w:r>
+    </w:p>
+    <w:p>
+      <w:pPr>
+        <w:rPr>
+          <w:lang w:val="en-US"/>
+        </w:rPr>
+      </w:pPr>
+      <w:r>
+        <w:rPr>
+          <w:noProof/>
           <w:lang w:val="en-US"/>
         </w:rPr>
         <w:drawing>
@@ -3095,6 +3200,361 @@
             </a:graphic>
           </wp:inline>
         </w:drawing>
+      </w:r>
+    </w:p>
+    <w:p>
+      <w:pPr>
+        <w:rPr>
+          <w:lang w:val="en-US"/>
+        </w:rPr>
+      </w:pPr>
+    </w:p>
+    <w:p>
+      <w:pPr>
+        <w:rPr>
+          <w:lang w:val="en-US"/>
+        </w:rPr>
+      </w:pPr>
+    </w:p>
+    <w:p>
+      <w:pPr>
+        <w:rPr>
+          <w:lang w:val="en-US"/>
+        </w:rPr>
+      </w:pPr>
+    </w:p>
+    <w:p>
+      <w:pPr>
+        <w:rPr>
+          <w:lang w:val="en-US"/>
+        </w:rPr>
+      </w:pPr>
+    </w:p>
+    <w:p>
+      <w:pPr>
+        <w:pStyle w:val="Ttulo2"/>
+        <w:rPr>
+          <w:lang w:val="en-US"/>
+        </w:rPr>
+      </w:pPr>
+      <w:bookmarkStart w:id="7" w:name="_Toc230527820"/>
+      <w:r>
+        <w:rPr>
+          <w:lang w:val="en-US"/>
+        </w:rPr>
+        <w:lastRenderedPageBreak/>
+        <w:t>GitHub Actions</w:t>
+      </w:r>
+      <w:bookmarkEnd w:id="7"/>
+    </w:p>
+    <w:p>
+      <w:pPr>
+        <w:rPr>
+          <w:lang w:val="en-US"/>
+        </w:rPr>
+      </w:pPr>
+      <w:r>
+        <w:rPr>
+          <w:lang w:val="en-US"/>
+        </w:rPr>
+        <w:t>The deployment workflow of this portfolio is entirely automated using GitHub Actions. By implementing a custom continuous integration and continuous deployment configuration fil</w:t>
+      </w:r>
+      <w:r>
+        <w:rPr>
+          <w:lang w:val="en-US"/>
+        </w:rPr>
+        <w:t>e,</w:t>
+      </w:r>
+      <w:r>
+        <w:rPr>
+          <w:lang w:val="en-US"/>
+        </w:rPr>
+        <w:t xml:space="preserve"> the manual process of building and deploying the application was </w:t>
+      </w:r>
+      <w:r>
+        <w:rPr>
+          <w:lang w:val="en-US"/>
+        </w:rPr>
+        <w:t>eliminated</w:t>
+      </w:r>
+      <w:r>
+        <w:rPr>
+          <w:lang w:val="en-US"/>
+        </w:rPr>
+        <w:t>.</w:t>
+      </w:r>
+    </w:p>
+    <w:p>
+      <w:pPr>
+        <w:rPr>
+          <w:lang w:val="en-US"/>
+        </w:rPr>
+      </w:pPr>
+      <w:r>
+        <w:rPr>
+          <w:lang w:val="en-US"/>
+        </w:rPr>
+        <w:drawing>
+          <wp:inline distT="0" distB="0" distL="0" distR="0" wp14:anchorId="25CFE942" wp14:editId="34345B2D">
+            <wp:extent cx="3029373" cy="390580"/>
+            <wp:effectExtent l="0" t="0" r="0" b="9525"/>
+            <wp:docPr id="672804091" name="Imagen 1"/>
+            <wp:cNvGraphicFramePr>
+              <a:graphicFrameLocks xmlns:a="http://schemas.openxmlformats.org/drawingml/2006/main" noChangeAspect="1"/>
+            </wp:cNvGraphicFramePr>
+            <a:graphic xmlns:a="http://schemas.openxmlformats.org/drawingml/2006/main">
+              <a:graphicData uri="http://schemas.openxmlformats.org/drawingml/2006/picture">
+                <pic:pic xmlns:pic="http://schemas.openxmlformats.org/drawingml/2006/picture">
+                  <pic:nvPicPr>
+                    <pic:cNvPr id="672804091" name=""/>
+                    <pic:cNvPicPr/>
+                  </pic:nvPicPr>
+                  <pic:blipFill>
+                    <a:blip r:embed="rId17"/>
+                    <a:stretch>
+                      <a:fillRect/>
+                    </a:stretch>
+                  </pic:blipFill>
+                  <pic:spPr>
+                    <a:xfrm>
+                      <a:off x="0" y="0"/>
+                      <a:ext cx="3029373" cy="390580"/>
+                    </a:xfrm>
+                    <a:prstGeom prst="rect">
+                      <a:avLst/>
+                    </a:prstGeom>
+                  </pic:spPr>
+                </pic:pic>
+              </a:graphicData>
+            </a:graphic>
+          </wp:inline>
+        </w:drawing>
+      </w:r>
+    </w:p>
+    <w:p>
+      <w:pPr>
+        <w:rPr>
+          <w:lang w:val="en-US"/>
+        </w:rPr>
+      </w:pPr>
+    </w:p>
+    <w:p>
+      <w:pPr>
+        <w:rPr>
+          <w:lang w:val="en-US"/>
+        </w:rPr>
+      </w:pPr>
+      <w:r>
+        <w:rPr>
+          <w:lang w:val="en-US"/>
+        </w:rPr>
+        <w:t>The workflow operates through three core steps:</w:t>
+      </w:r>
+    </w:p>
+    <w:p>
+      <w:pPr>
+        <w:rPr>
+          <w:lang w:val="en-US"/>
+        </w:rPr>
+      </w:pPr>
+      <w:r>
+        <w:rPr>
+          <w:lang w:val="en-US"/>
+        </w:rPr>
+        <w:t>Trigger: Every time a new commit is pushed to the main branch</w:t>
+      </w:r>
+      <w:r>
+        <w:rPr>
+          <w:lang w:val="en-US"/>
+        </w:rPr>
+        <w:t xml:space="preserve">. </w:t>
+      </w:r>
+      <w:r>
+        <w:rPr>
+          <w:lang w:val="en-US"/>
+        </w:rPr>
+        <w:t xml:space="preserve">GitHub automatically detects the change and triggers the </w:t>
+      </w:r>
+      <w:r>
+        <w:rPr>
+          <w:lang w:val="en-US"/>
+        </w:rPr>
+        <w:t>action</w:t>
+      </w:r>
+      <w:r>
+        <w:rPr>
+          <w:lang w:val="en-US"/>
+        </w:rPr>
+        <w:t>.</w:t>
+      </w:r>
+    </w:p>
+    <w:p>
+      <w:pPr>
+        <w:rPr>
+          <w:lang w:val="en-US"/>
+        </w:rPr>
+      </w:pPr>
+    </w:p>
+    <w:p>
+      <w:pPr>
+        <w:rPr>
+          <w:lang w:val="en-US"/>
+        </w:rPr>
+      </w:pPr>
+      <w:r>
+        <w:rPr>
+          <w:lang w:val="en-US"/>
+        </w:rPr>
+        <w:t>Build</w:t>
+      </w:r>
+      <w:r>
+        <w:rPr>
+          <w:lang w:val="en-US"/>
+        </w:rPr>
+        <w:t>ing</w:t>
+      </w:r>
+      <w:r>
+        <w:rPr>
+          <w:lang w:val="en-US"/>
+        </w:rPr>
+        <w:t xml:space="preserve"> </w:t>
+      </w:r>
+      <w:r>
+        <w:rPr>
+          <w:lang w:val="en-US"/>
+        </w:rPr>
+        <w:t>p</w:t>
+      </w:r>
+      <w:r>
+        <w:rPr>
+          <w:lang w:val="en-US"/>
+        </w:rPr>
+        <w:t xml:space="preserve">rocess: GitHub </w:t>
+      </w:r>
+      <w:r>
+        <w:rPr>
+          <w:lang w:val="en-US"/>
+        </w:rPr>
+        <w:t>provides</w:t>
+      </w:r>
+      <w:r>
+        <w:rPr>
+          <w:lang w:val="en-US"/>
+        </w:rPr>
+        <w:t xml:space="preserve"> a clean, temporary Linux virtual machine. It checks out the latest code version, installs the necessary dependencies, and executes Vite's optimized production build engine</w:t>
+      </w:r>
+      <w:r>
+        <w:rPr>
+          <w:lang w:val="en-US"/>
+        </w:rPr>
+        <w:t xml:space="preserve">. </w:t>
+      </w:r>
+      <w:r>
+        <w:rPr>
+          <w:lang w:val="en-US"/>
+        </w:rPr>
+        <w:t xml:space="preserve">This compiles the source React code into </w:t>
+      </w:r>
+      <w:r>
+        <w:rPr>
+          <w:lang w:val="en-US"/>
+        </w:rPr>
+        <w:t>a</w:t>
+      </w:r>
+      <w:r>
+        <w:rPr>
+          <w:lang w:val="en-US"/>
+        </w:rPr>
+        <w:t xml:space="preserve"> static asset stored in the /dist directory.</w:t>
+      </w:r>
+    </w:p>
+    <w:p>
+      <w:pPr>
+        <w:rPr>
+          <w:lang w:val="en-US"/>
+        </w:rPr>
+      </w:pPr>
+    </w:p>
+    <w:p>
+      <w:pPr>
+        <w:rPr>
+          <w:lang w:val="en-US"/>
+        </w:rPr>
+      </w:pPr>
+      <w:r>
+        <w:rPr>
+          <w:lang w:val="en-US"/>
+        </w:rPr>
+        <w:lastRenderedPageBreak/>
+        <w:t xml:space="preserve">The Deployment: Using Microsoft’s official Static Web Apps deployment action, the pipeline securely uploads the compiled /dist folder directly to Azure’s </w:t>
+      </w:r>
+      <w:r>
+        <w:rPr>
+          <w:lang w:val="en-US"/>
+        </w:rPr>
+        <w:t>CDN.</w:t>
+      </w:r>
+    </w:p>
+    <w:p>
+      <w:pPr>
+        <w:rPr>
+          <w:lang w:val="en-US"/>
+        </w:rPr>
+      </w:pPr>
+    </w:p>
+    <w:p>
+      <w:pPr>
+        <w:rPr>
+          <w:lang w:val="en-US"/>
+        </w:rPr>
+      </w:pPr>
+      <w:r>
+        <w:rPr>
+          <w:lang w:val="en-US"/>
+        </w:rPr>
+        <w:t>In addition</w:t>
+      </w:r>
+      <w:r>
+        <w:rPr>
+          <w:lang w:val="en-US"/>
+        </w:rPr>
+        <w:t xml:space="preserve">, the workflow configuration includes an explicit </w:t>
+      </w:r>
+      <w:r>
+        <w:rPr>
+          <w:lang w:val="en-US"/>
+        </w:rPr>
+        <w:t>“</w:t>
+      </w:r>
+      <w:r>
+        <w:rPr>
+          <w:lang w:val="en-US"/>
+        </w:rPr>
+        <w:t>skip_api_build: true</w:t>
+      </w:r>
+      <w:r>
+        <w:rPr>
+          <w:lang w:val="en-US"/>
+        </w:rPr>
+        <w:t>” indication</w:t>
+      </w:r>
+      <w:r>
+        <w:rPr>
+          <w:lang w:val="en-US"/>
+        </w:rPr>
+        <w:t xml:space="preserve">. This prevents the deployment engine from scanning for backend components, </w:t>
+      </w:r>
+      <w:r>
+        <w:rPr>
+          <w:lang w:val="en-US"/>
+        </w:rPr>
+        <w:t xml:space="preserve">optimizing </w:t>
+      </w:r>
+      <w:r>
+        <w:rPr>
+          <w:lang w:val="en-US"/>
+        </w:rPr>
+        <w:t>build speeds down to just a few seconds.</w:t>
       </w:r>
     </w:p>
     <w:sectPr>

</xml_diff>

<commit_message>
Minor spelling mistake corrected.
</commit_message>
<xml_diff>
--- a/Documentation/Personal Web Portfolio Documentation.docx
+++ b/Documentation/Personal Web Portfolio Documentation.docx
@@ -233,6 +233,7 @@
       </w:pPr>
       <w:r>
         <w:rPr>
+          <w:noProof/>
           <w:lang w:val="en-US"/>
         </w:rPr>
         <w:drawing>
@@ -348,7 +349,7 @@
         </w:rPr>
         <w:fldChar w:fldCharType="separate"/>
       </w:r>
-      <w:hyperlink w:anchor="_Toc230527813" w:history="1">
+      <w:hyperlink w:anchor="_Toc230533606" w:history="1">
         <w:r>
           <w:rPr>
             <w:rStyle w:val="Hipervnculo"/>
@@ -376,7 +377,7 @@
             <w:noProof/>
             <w:webHidden/>
           </w:rPr>
-          <w:instrText xml:space="preserve"> PAGEREF _Toc230527813 \h </w:instrText>
+          <w:instrText xml:space="preserve"> PAGEREF _Toc230533606 \h </w:instrText>
         </w:r>
         <w:r>
           <w:rPr>
@@ -422,7 +423,7 @@
           <w:szCs w:val="24"/>
         </w:rPr>
       </w:pPr>
-      <w:hyperlink w:anchor="_Toc230527814" w:history="1">
+      <w:hyperlink w:anchor="_Toc230533607" w:history="1">
         <w:r>
           <w:rPr>
             <w:rStyle w:val="Hipervnculo"/>
@@ -450,7 +451,7 @@
             <w:noProof/>
             <w:webHidden/>
           </w:rPr>
-          <w:instrText xml:space="preserve"> PAGEREF _Toc230527814 \h </w:instrText>
+          <w:instrText xml:space="preserve"> PAGEREF _Toc230533607 \h </w:instrText>
         </w:r>
         <w:r>
           <w:rPr>
@@ -496,7 +497,7 @@
           <w:szCs w:val="24"/>
         </w:rPr>
       </w:pPr>
-      <w:hyperlink w:anchor="_Toc230527815" w:history="1">
+      <w:hyperlink w:anchor="_Toc230533608" w:history="1">
         <w:r>
           <w:rPr>
             <w:rStyle w:val="Hipervnculo"/>
@@ -524,7 +525,7 @@
             <w:noProof/>
             <w:webHidden/>
           </w:rPr>
-          <w:instrText xml:space="preserve"> PAGEREF _Toc230527815 \h </w:instrText>
+          <w:instrText xml:space="preserve"> PAGEREF _Toc230533608 \h </w:instrText>
         </w:r>
         <w:r>
           <w:rPr>
@@ -570,7 +571,7 @@
           <w:szCs w:val="24"/>
         </w:rPr>
       </w:pPr>
-      <w:hyperlink w:anchor="_Toc230527816" w:history="1">
+      <w:hyperlink w:anchor="_Toc230533609" w:history="1">
         <w:r>
           <w:rPr>
             <w:rStyle w:val="Hipervnculo"/>
@@ -598,7 +599,7 @@
             <w:noProof/>
             <w:webHidden/>
           </w:rPr>
-          <w:instrText xml:space="preserve"> PAGEREF _Toc230527816 \h </w:instrText>
+          <w:instrText xml:space="preserve"> PAGEREF _Toc230533609 \h </w:instrText>
         </w:r>
         <w:r>
           <w:rPr>
@@ -645,7 +646,7 @@
           <w:u w:val="none"/>
         </w:rPr>
       </w:pPr>
-      <w:hyperlink w:anchor="_Toc230527817" w:history="1">
+      <w:hyperlink w:anchor="_Toc230533610" w:history="1">
         <w:r>
           <w:rPr>
             <w:rStyle w:val="Hipervnculo"/>
@@ -673,7 +674,7 @@
             <w:noProof/>
             <w:webHidden/>
           </w:rPr>
-          <w:instrText xml:space="preserve"> PAGEREF _Toc230527817 \h </w:instrText>
+          <w:instrText xml:space="preserve"> PAGEREF _Toc230533610 \h </w:instrText>
         </w:r>
         <w:r>
           <w:rPr>
@@ -719,7 +720,7 @@
           <w:szCs w:val="24"/>
         </w:rPr>
       </w:pPr>
-      <w:hyperlink w:anchor="_Toc230527818" w:history="1">
+      <w:hyperlink w:anchor="_Toc230533611" w:history="1">
         <w:r>
           <w:rPr>
             <w:rStyle w:val="Hipervnculo"/>
@@ -747,7 +748,7 @@
             <w:noProof/>
             <w:webHidden/>
           </w:rPr>
-          <w:instrText xml:space="preserve"> PAGEREF _Toc230527818 \h </w:instrText>
+          <w:instrText xml:space="preserve"> PAGEREF _Toc230533611 \h </w:instrText>
         </w:r>
         <w:r>
           <w:rPr>
@@ -793,14 +794,14 @@
           <w:szCs w:val="24"/>
         </w:rPr>
       </w:pPr>
-      <w:hyperlink w:anchor="_Toc230527819" w:history="1">
+      <w:hyperlink w:anchor="_Toc230533612" w:history="1">
         <w:r>
           <w:rPr>
             <w:rStyle w:val="Hipervnculo"/>
             <w:noProof/>
             <w:lang w:val="en-US"/>
           </w:rPr>
-          <w:t>Azure Cloude</w:t>
+          <w:t>Azure Cloud</w:t>
         </w:r>
         <w:r>
           <w:rPr>
@@ -821,7 +822,7 @@
             <w:noProof/>
             <w:webHidden/>
           </w:rPr>
-          <w:instrText xml:space="preserve"> PAGEREF _Toc230527819 \h </w:instrText>
+          <w:instrText xml:space="preserve"> PAGEREF _Toc230533612 \h </w:instrText>
         </w:r>
         <w:r>
           <w:rPr>
@@ -867,7 +868,7 @@
           <w:szCs w:val="24"/>
         </w:rPr>
       </w:pPr>
-      <w:hyperlink w:anchor="_Toc230527820" w:history="1">
+      <w:hyperlink w:anchor="_Toc230533613" w:history="1">
         <w:r>
           <w:rPr>
             <w:rStyle w:val="Hipervnculo"/>
@@ -895,7 +896,7 @@
             <w:noProof/>
             <w:webHidden/>
           </w:rPr>
-          <w:instrText xml:space="preserve"> PAGEREF _Toc230527820 \h </w:instrText>
+          <w:instrText xml:space="preserve"> PAGEREF _Toc230533613 \h </w:instrText>
         </w:r>
         <w:r>
           <w:rPr>
@@ -962,7 +963,7 @@
           <w:lang w:val="en-US"/>
         </w:rPr>
       </w:pPr>
-      <w:bookmarkStart w:id="0" w:name="_Toc230527813"/>
+      <w:bookmarkStart w:id="0" w:name="_Toc230533606"/>
       <w:r>
         <w:rPr>
           <w:color w:val="CC3333"/>
@@ -992,7 +993,7 @@
           <w:lang w:val="en-US"/>
         </w:rPr>
       </w:pPr>
-      <w:bookmarkStart w:id="1" w:name="_Toc230527814"/>
+      <w:bookmarkStart w:id="1" w:name="_Toc230533607"/>
       <w:r>
         <w:rPr>
           <w:rStyle w:val="Ttulo2Car"/>
@@ -1061,7 +1062,7 @@
           <w:lang w:val="en-US"/>
         </w:rPr>
       </w:pPr>
-      <w:bookmarkStart w:id="2" w:name="_Toc230527815"/>
+      <w:bookmarkStart w:id="2" w:name="_Toc230533608"/>
       <w:r>
         <w:rPr>
           <w:lang w:val="en-US"/>
@@ -1335,8 +1336,20 @@
                 <w14:ligatures w14:val="none"/>
               </w:rPr>
               <w:br/>
+            </w:r>
+            <w:proofErr w:type="spellStart"/>
+            <w:r>
+              <w:rPr>
+                <w:rFonts w:eastAsia="Times New Roman" w:cs="Times New Roman"/>
+                <w:color w:val="000000"/>
+                <w:kern w:val="0"/>
+                <w:sz w:val="22"/>
+                <w:szCs w:val="22"/>
+                <w14:ligatures w14:val="none"/>
+              </w:rPr>
               <w:t>Background</w:t>
             </w:r>
+            <w:proofErr w:type="spellEnd"/>
           </w:p>
         </w:tc>
         <w:tc>
@@ -1384,8 +1397,20 @@
                 <w14:ligatures w14:val="none"/>
               </w:rPr>
               <w:br/>
+            </w:r>
+            <w:proofErr w:type="spellStart"/>
+            <w:r>
+              <w:rPr>
+                <w:rFonts w:eastAsia="Times New Roman" w:cs="Times New Roman"/>
+                <w:color w:val="000000"/>
+                <w:kern w:val="0"/>
+                <w:sz w:val="22"/>
+                <w:szCs w:val="22"/>
+                <w14:ligatures w14:val="none"/>
+              </w:rPr>
               <w:t>Cards</w:t>
             </w:r>
+            <w:proofErr w:type="spellEnd"/>
           </w:p>
         </w:tc>
         <w:tc>
@@ -1482,8 +1507,44 @@
                 <w14:ligatures w14:val="none"/>
               </w:rPr>
               <w:br/>
-              <w:t>Primary accent</w:t>
             </w:r>
+            <w:proofErr w:type="spellStart"/>
+            <w:r>
+              <w:rPr>
+                <w:rFonts w:eastAsia="Times New Roman" w:cs="Times New Roman"/>
+                <w:color w:val="000000"/>
+                <w:kern w:val="0"/>
+                <w:sz w:val="22"/>
+                <w:szCs w:val="22"/>
+                <w14:ligatures w14:val="none"/>
+              </w:rPr>
+              <w:t>Primary</w:t>
+            </w:r>
+            <w:proofErr w:type="spellEnd"/>
+            <w:r>
+              <w:rPr>
+                <w:rFonts w:eastAsia="Times New Roman" w:cs="Times New Roman"/>
+                <w:color w:val="000000"/>
+                <w:kern w:val="0"/>
+                <w:sz w:val="22"/>
+                <w:szCs w:val="22"/>
+                <w14:ligatures w14:val="none"/>
+              </w:rPr>
+              <w:t xml:space="preserve"> </w:t>
+            </w:r>
+            <w:proofErr w:type="spellStart"/>
+            <w:r>
+              <w:rPr>
+                <w:rFonts w:eastAsia="Times New Roman" w:cs="Times New Roman"/>
+                <w:color w:val="000000"/>
+                <w:kern w:val="0"/>
+                <w:sz w:val="22"/>
+                <w:szCs w:val="22"/>
+                <w14:ligatures w14:val="none"/>
+              </w:rPr>
+              <w:t>accent</w:t>
+            </w:r>
+            <w:proofErr w:type="spellEnd"/>
           </w:p>
         </w:tc>
       </w:tr>
@@ -1652,8 +1713,44 @@
                 <w14:ligatures w14:val="none"/>
               </w:rPr>
               <w:br/>
-              <w:t>Primary text</w:t>
             </w:r>
+            <w:proofErr w:type="spellStart"/>
+            <w:r>
+              <w:rPr>
+                <w:rFonts w:eastAsia="Times New Roman" w:cs="Times New Roman"/>
+                <w:color w:val="000000"/>
+                <w:kern w:val="0"/>
+                <w:sz w:val="22"/>
+                <w:szCs w:val="22"/>
+                <w14:ligatures w14:val="none"/>
+              </w:rPr>
+              <w:t>Primary</w:t>
+            </w:r>
+            <w:proofErr w:type="spellEnd"/>
+            <w:r>
+              <w:rPr>
+                <w:rFonts w:eastAsia="Times New Roman" w:cs="Times New Roman"/>
+                <w:color w:val="000000"/>
+                <w:kern w:val="0"/>
+                <w:sz w:val="22"/>
+                <w:szCs w:val="22"/>
+                <w14:ligatures w14:val="none"/>
+              </w:rPr>
+              <w:t xml:space="preserve"> </w:t>
+            </w:r>
+            <w:proofErr w:type="spellStart"/>
+            <w:r>
+              <w:rPr>
+                <w:rFonts w:eastAsia="Times New Roman" w:cs="Times New Roman"/>
+                <w:color w:val="000000"/>
+                <w:kern w:val="0"/>
+                <w:sz w:val="22"/>
+                <w:szCs w:val="22"/>
+                <w14:ligatures w14:val="none"/>
+              </w:rPr>
+              <w:t>text</w:t>
+            </w:r>
+            <w:proofErr w:type="spellEnd"/>
           </w:p>
         </w:tc>
         <w:tc>
@@ -1750,8 +1847,44 @@
                 <w14:ligatures w14:val="none"/>
               </w:rPr>
               <w:br/>
-              <w:t>Secondary text</w:t>
             </w:r>
+            <w:proofErr w:type="spellStart"/>
+            <w:r>
+              <w:rPr>
+                <w:rFonts w:eastAsia="Times New Roman" w:cs="Times New Roman"/>
+                <w:color w:val="000000"/>
+                <w:kern w:val="0"/>
+                <w:sz w:val="22"/>
+                <w:szCs w:val="22"/>
+                <w14:ligatures w14:val="none"/>
+              </w:rPr>
+              <w:t>Secondary</w:t>
+            </w:r>
+            <w:proofErr w:type="spellEnd"/>
+            <w:r>
+              <w:rPr>
+                <w:rFonts w:eastAsia="Times New Roman" w:cs="Times New Roman"/>
+                <w:color w:val="000000"/>
+                <w:kern w:val="0"/>
+                <w:sz w:val="22"/>
+                <w:szCs w:val="22"/>
+                <w14:ligatures w14:val="none"/>
+              </w:rPr>
+              <w:t xml:space="preserve"> </w:t>
+            </w:r>
+            <w:proofErr w:type="spellStart"/>
+            <w:r>
+              <w:rPr>
+                <w:rFonts w:eastAsia="Times New Roman" w:cs="Times New Roman"/>
+                <w:color w:val="000000"/>
+                <w:kern w:val="0"/>
+                <w:sz w:val="22"/>
+                <w:szCs w:val="22"/>
+                <w14:ligatures w14:val="none"/>
+              </w:rPr>
+              <w:t>text</w:t>
+            </w:r>
+            <w:proofErr w:type="spellEnd"/>
           </w:p>
         </w:tc>
         <w:tc>
@@ -1800,7 +1933,21 @@
         <w:rPr>
           <w:lang w:val="en-US"/>
         </w:rPr>
-        <w:t>The website is distributed within a “One Page Design” and the NavBar is a “Sticky” one as it is always visible.</w:t>
+        <w:t xml:space="preserve">The website is distributed within a “One Page Design” and the </w:t>
+      </w:r>
+      <w:proofErr w:type="spellStart"/>
+      <w:r>
+        <w:rPr>
+          <w:lang w:val="en-US"/>
+        </w:rPr>
+        <w:t>NavBar</w:t>
+      </w:r>
+      <w:proofErr w:type="spellEnd"/>
+      <w:r>
+        <w:rPr>
+          <w:lang w:val="en-US"/>
+        </w:rPr>
+        <w:t xml:space="preserve"> is a “Sticky” one as it is always visible.</w:t>
       </w:r>
       <w:r>
         <w:rPr>
@@ -1844,7 +1991,63 @@
         <w:rPr>
           <w:lang w:val="en-US"/>
         </w:rPr>
-        <w:t>on seven components (Intro, About me, Career, Education, Skills &amp; Certs, Projects and Contact) each one developed on different JSXs. The NavBar possesses access to each of these segments and allows to return back to the top easily</w:t>
+        <w:t xml:space="preserve">on seven components (Intro, </w:t>
+      </w:r>
+      <w:proofErr w:type="gramStart"/>
+      <w:r>
+        <w:rPr>
+          <w:lang w:val="en-US"/>
+        </w:rPr>
+        <w:t>About</w:t>
+      </w:r>
+      <w:proofErr w:type="gramEnd"/>
+      <w:r>
+        <w:rPr>
+          <w:lang w:val="en-US"/>
+        </w:rPr>
+        <w:t xml:space="preserve"> me, Career, Education, Skills &amp; Certs, Projects and Contact) each one developed on different JSXs. The </w:t>
+      </w:r>
+      <w:proofErr w:type="spellStart"/>
+      <w:r>
+        <w:rPr>
+          <w:lang w:val="en-US"/>
+        </w:rPr>
+        <w:t>NavBar</w:t>
+      </w:r>
+      <w:proofErr w:type="spellEnd"/>
+      <w:r>
+        <w:rPr>
+          <w:lang w:val="en-US"/>
+        </w:rPr>
+        <w:t xml:space="preserve"> possesses access to each of these segments and </w:t>
+      </w:r>
+      <w:proofErr w:type="gramStart"/>
+      <w:r>
+        <w:rPr>
+          <w:lang w:val="en-US"/>
+        </w:rPr>
+        <w:t>allows</w:t>
+      </w:r>
+      <w:proofErr w:type="gramEnd"/>
+      <w:r>
+        <w:rPr>
+          <w:lang w:val="en-US"/>
+        </w:rPr>
+        <w:t xml:space="preserve"> to </w:t>
+      </w:r>
+      <w:proofErr w:type="gramStart"/>
+      <w:r>
+        <w:rPr>
+          <w:lang w:val="en-US"/>
+        </w:rPr>
+        <w:t>return back</w:t>
+      </w:r>
+      <w:proofErr w:type="gramEnd"/>
+      <w:r>
+        <w:rPr>
+          <w:lang w:val="en-US"/>
+        </w:rPr>
+        <w:t xml:space="preserve"> to the top easily</w:t>
       </w:r>
       <w:r>
         <w:rPr>
@@ -1862,7 +2065,21 @@
         <w:rPr>
           <w:lang w:val="en-US"/>
         </w:rPr>
-        <w:t>. The footer has my name and the last year the website was updated.</w:t>
+        <w:t xml:space="preserve">. The footer has my name and </w:t>
+      </w:r>
+      <w:proofErr w:type="gramStart"/>
+      <w:r>
+        <w:rPr>
+          <w:lang w:val="en-US"/>
+        </w:rPr>
+        <w:t>the last</w:t>
+      </w:r>
+      <w:proofErr w:type="gramEnd"/>
+      <w:r>
+        <w:rPr>
+          <w:lang w:val="en-US"/>
+        </w:rPr>
+        <w:t xml:space="preserve"> year the website was updated.</w:t>
       </w:r>
     </w:p>
     <w:p>
@@ -1886,7 +2103,7 @@
           <w:lang w:val="en-US"/>
         </w:rPr>
       </w:pPr>
-      <w:bookmarkStart w:id="3" w:name="_Toc230527816"/>
+      <w:bookmarkStart w:id="3" w:name="_Toc230533609"/>
       <w:r>
         <w:rPr>
           <w:lang w:val="en-US"/>
@@ -1905,7 +2122,21 @@
         <w:rPr>
           <w:lang w:val="en-US"/>
         </w:rPr>
-        <w:t>The project follows a modular, component-based structure, where all core logic is organized inside the /src directory.</w:t>
+        <w:t>The project follows a modular, component-based structure, where all core logic is organized inside the /</w:t>
+      </w:r>
+      <w:proofErr w:type="spellStart"/>
+      <w:r>
+        <w:rPr>
+          <w:lang w:val="en-US"/>
+        </w:rPr>
+        <w:t>src</w:t>
+      </w:r>
+      <w:proofErr w:type="spellEnd"/>
+      <w:r>
+        <w:rPr>
+          <w:lang w:val="en-US"/>
+        </w:rPr>
+        <w:t xml:space="preserve"> directory.</w:t>
       </w:r>
     </w:p>
     <w:p>
@@ -1937,8 +2168,16 @@
         <w:rPr>
           <w:lang w:val="en-US"/>
         </w:rPr>
-        <w:t xml:space="preserve"> within the Index.j</w:t>
-      </w:r>
+        <w:t xml:space="preserve"> within the </w:t>
+      </w:r>
+      <w:proofErr w:type="spellStart"/>
+      <w:r>
+        <w:rPr>
+          <w:lang w:val="en-US"/>
+        </w:rPr>
+        <w:t>Index.j</w:t>
+      </w:r>
+      <w:proofErr w:type="spellEnd"/>
       <w:r>
         <w:rPr>
           <w:lang w:val="en-US"/>
@@ -1965,12 +2204,34 @@
           <w:lang w:val="en-US"/>
         </w:rPr>
       </w:pPr>
+      <w:proofErr w:type="spellStart"/>
       <w:r>
         <w:rPr>
           <w:lang w:val="en-US"/>
         </w:rPr>
         <w:lastRenderedPageBreak/>
-        <w:t>App.jsx defines the main layout, and Main.jsx handles application rendering.</w:t>
+        <w:t>App.jsx</w:t>
+      </w:r>
+      <w:proofErr w:type="spellEnd"/>
+      <w:r>
+        <w:rPr>
+          <w:lang w:val="en-US"/>
+        </w:rPr>
+        <w:t xml:space="preserve"> defines the main layout, and </w:t>
+      </w:r>
+      <w:proofErr w:type="spellStart"/>
+      <w:r>
+        <w:rPr>
+          <w:lang w:val="en-US"/>
+        </w:rPr>
+        <w:t>Main.jsx</w:t>
+      </w:r>
+      <w:proofErr w:type="spellEnd"/>
+      <w:r>
+        <w:rPr>
+          <w:lang w:val="en-US"/>
+        </w:rPr>
+        <w:t xml:space="preserve"> handles application rendering.</w:t>
       </w:r>
     </w:p>
     <w:p>
@@ -1994,6 +2255,7 @@
       </w:pPr>
       <w:r>
         <w:rPr>
+          <w:noProof/>
           <w:lang w:val="en-US"/>
         </w:rPr>
         <w:drawing>
@@ -2048,7 +2310,7 @@
           <w:lang w:val="en-US"/>
         </w:rPr>
       </w:pPr>
-      <w:bookmarkStart w:id="4" w:name="_Toc230527817"/>
+      <w:bookmarkStart w:id="4" w:name="_Toc230533610"/>
       <w:r>
         <w:rPr>
           <w:lang w:val="en-US"/>
@@ -2072,7 +2334,7 @@
           <w:lang w:val="en-US"/>
         </w:rPr>
       </w:pPr>
-      <w:bookmarkStart w:id="5" w:name="_Toc230527818"/>
+      <w:bookmarkStart w:id="5" w:name="_Toc230533611"/>
       <w:r>
         <w:rPr>
           <w:lang w:val="en-US"/>
@@ -2091,7 +2353,43 @@
         <w:rPr>
           <w:lang w:val="en-US"/>
         </w:rPr>
-        <w:t>Created Dockerfile and .dockerignore into React project root.</w:t>
+        <w:t xml:space="preserve">Created </w:t>
+      </w:r>
+      <w:proofErr w:type="spellStart"/>
+      <w:r>
+        <w:rPr>
+          <w:lang w:val="en-US"/>
+        </w:rPr>
+        <w:t>Dockerfile</w:t>
+      </w:r>
+      <w:proofErr w:type="spellEnd"/>
+      <w:r>
+        <w:rPr>
+          <w:lang w:val="en-US"/>
+        </w:rPr>
+        <w:t xml:space="preserve"> </w:t>
+      </w:r>
+      <w:proofErr w:type="gramStart"/>
+      <w:r>
+        <w:rPr>
+          <w:lang w:val="en-US"/>
+        </w:rPr>
+        <w:t>and .</w:t>
+      </w:r>
+      <w:proofErr w:type="spellStart"/>
+      <w:r>
+        <w:rPr>
+          <w:lang w:val="en-US"/>
+        </w:rPr>
+        <w:t>dockerignore</w:t>
+      </w:r>
+      <w:proofErr w:type="spellEnd"/>
+      <w:proofErr w:type="gramEnd"/>
+      <w:r>
+        <w:rPr>
+          <w:lang w:val="en-US"/>
+        </w:rPr>
+        <w:t xml:space="preserve"> into React project root.</w:t>
       </w:r>
       <w:r>
         <w:rPr>
@@ -2213,17 +2511,47 @@
           <w:lang w:val="en-US"/>
         </w:rPr>
       </w:pPr>
-      <w:r>
-        <w:rPr>
-          <w:lang w:val="en-US"/>
-        </w:rPr>
-        <w:t xml:space="preserve">.docker ignore </w:t>
-      </w:r>
-      <w:r>
-        <w:rPr>
-          <w:lang w:val="en-US"/>
-        </w:rPr>
-        <w:t>makes sure unnecessary files for contained versions of the website don’t add up space to the container nor cause compatibility issues:</w:t>
+      <w:proofErr w:type="gramStart"/>
+      <w:r>
+        <w:rPr>
+          <w:lang w:val="en-US"/>
+        </w:rPr>
+        <w:t>.docker</w:t>
+      </w:r>
+      <w:proofErr w:type="gramEnd"/>
+      <w:r>
+        <w:rPr>
+          <w:lang w:val="en-US"/>
+        </w:rPr>
+        <w:t xml:space="preserve"> </w:t>
+      </w:r>
+      <w:proofErr w:type="gramStart"/>
+      <w:r>
+        <w:rPr>
+          <w:lang w:val="en-US"/>
+        </w:rPr>
+        <w:t>ignore</w:t>
+      </w:r>
+      <w:proofErr w:type="gramEnd"/>
+      <w:r>
+        <w:rPr>
+          <w:lang w:val="en-US"/>
+        </w:rPr>
+        <w:t xml:space="preserve"> </w:t>
+      </w:r>
+      <w:proofErr w:type="gramStart"/>
+      <w:r>
+        <w:rPr>
+          <w:lang w:val="en-US"/>
+        </w:rPr>
+        <w:t>makes</w:t>
+      </w:r>
+      <w:proofErr w:type="gramEnd"/>
+      <w:r>
+        <w:rPr>
+          <w:lang w:val="en-US"/>
+        </w:rPr>
+        <w:t xml:space="preserve"> sure unnecessary files for contained versions of the website don’t add up space to the container nor cause compatibility issues:</w:t>
       </w:r>
     </w:p>
     <w:p>
@@ -2235,6 +2563,7 @@
           <w:lang w:val="en-US"/>
         </w:rPr>
       </w:pPr>
+      <w:proofErr w:type="spellStart"/>
       <w:r>
         <w:rPr>
           <w:sz w:val="28"/>
@@ -2243,6 +2572,7 @@
         </w:rPr>
         <w:t>node_modules</w:t>
       </w:r>
+      <w:proofErr w:type="spellEnd"/>
       <w:r>
         <w:rPr>
           <w:sz w:val="28"/>
@@ -2261,6 +2591,7 @@
           <w:lang w:val="en-US"/>
         </w:rPr>
       </w:pPr>
+      <w:proofErr w:type="gramStart"/>
       <w:r>
         <w:rPr>
           <w:sz w:val="28"/>
@@ -2269,6 +2600,7 @@
         </w:rPr>
         <w:t>.git</w:t>
       </w:r>
+      <w:proofErr w:type="gramEnd"/>
       <w:r>
         <w:rPr>
           <w:sz w:val="28"/>
@@ -2303,22 +2635,26 @@
           <w:lang w:val="en-US"/>
         </w:rPr>
       </w:pPr>
+      <w:proofErr w:type="gramStart"/>
       <w:r>
         <w:rPr>
           <w:sz w:val="28"/>
           <w:szCs w:val="28"/>
           <w:lang w:val="en-US"/>
         </w:rPr>
-        <w:t>.github</w:t>
-      </w:r>
+        <w:t>.</w:t>
+      </w:r>
+      <w:proofErr w:type="spellStart"/>
       <w:r>
         <w:rPr>
           <w:sz w:val="28"/>
           <w:szCs w:val="28"/>
           <w:lang w:val="en-US"/>
         </w:rPr>
-        <w:tab/>
-      </w:r>
+        <w:t>github</w:t>
+      </w:r>
+      <w:proofErr w:type="spellEnd"/>
+      <w:proofErr w:type="gramEnd"/>
       <w:r>
         <w:rPr>
           <w:sz w:val="28"/>
@@ -2327,31 +2663,32 @@
         </w:rPr>
         <w:tab/>
       </w:r>
-    </w:p>
-    <w:p>
-      <w:pPr>
-        <w:pStyle w:val="Sinespaciado"/>
+      <w:r>
         <w:rPr>
           <w:sz w:val="28"/>
           <w:szCs w:val="28"/>
           <w:lang w:val="en-US"/>
         </w:rPr>
-      </w:pPr>
-      <w:r>
+        <w:tab/>
+      </w:r>
+    </w:p>
+    <w:p>
+      <w:pPr>
+        <w:pStyle w:val="Sinespaciado"/>
         <w:rPr>
           <w:sz w:val="28"/>
           <w:szCs w:val="28"/>
           <w:lang w:val="en-US"/>
         </w:rPr>
-        <w:t>d</w:t>
-      </w:r>
+      </w:pPr>
+      <w:proofErr w:type="spellStart"/>
       <w:r>
         <w:rPr>
           <w:sz w:val="28"/>
           <w:szCs w:val="28"/>
           <w:lang w:val="en-US"/>
         </w:rPr>
-        <w:t>ist</w:t>
+        <w:t>d</w:t>
       </w:r>
       <w:r>
         <w:rPr>
@@ -2359,8 +2696,9 @@
           <w:szCs w:val="28"/>
           <w:lang w:val="en-US"/>
         </w:rPr>
-        <w:tab/>
-      </w:r>
+        <w:t>ist</w:t>
+      </w:r>
+      <w:proofErr w:type="spellEnd"/>
       <w:r>
         <w:rPr>
           <w:sz w:val="28"/>
@@ -2377,31 +2715,31 @@
         </w:rPr>
         <w:tab/>
       </w:r>
-    </w:p>
-    <w:p>
-      <w:pPr>
-        <w:pStyle w:val="Sinespaciado"/>
+      <w:r>
         <w:rPr>
           <w:sz w:val="28"/>
           <w:szCs w:val="28"/>
           <w:lang w:val="en-US"/>
         </w:rPr>
-      </w:pPr>
-      <w:r>
+        <w:tab/>
+      </w:r>
+    </w:p>
+    <w:p>
+      <w:pPr>
+        <w:pStyle w:val="Sinespaciado"/>
         <w:rPr>
           <w:sz w:val="28"/>
           <w:szCs w:val="28"/>
           <w:lang w:val="en-US"/>
         </w:rPr>
-        <w:t>B</w:t>
-      </w:r>
+      </w:pPr>
       <w:r>
         <w:rPr>
           <w:sz w:val="28"/>
           <w:szCs w:val="28"/>
           <w:lang w:val="en-US"/>
         </w:rPr>
-        <w:t>uild</w:t>
+        <w:t>B</w:t>
       </w:r>
       <w:r>
         <w:rPr>
@@ -2409,7 +2747,7 @@
           <w:szCs w:val="28"/>
           <w:lang w:val="en-US"/>
         </w:rPr>
-        <w:tab/>
+        <w:t>uild</w:t>
       </w:r>
       <w:r>
         <w:rPr>
@@ -2427,50 +2765,52 @@
         </w:rPr>
         <w:tab/>
       </w:r>
-    </w:p>
-    <w:p>
-      <w:pPr>
-        <w:pStyle w:val="Sinespaciado"/>
+      <w:r>
         <w:rPr>
           <w:sz w:val="28"/>
           <w:szCs w:val="28"/>
           <w:lang w:val="en-US"/>
         </w:rPr>
-      </w:pPr>
-      <w:r>
+        <w:tab/>
+      </w:r>
+    </w:p>
+    <w:p>
+      <w:pPr>
+        <w:pStyle w:val="Sinespaciado"/>
         <w:rPr>
           <w:sz w:val="28"/>
           <w:szCs w:val="28"/>
           <w:lang w:val="en-US"/>
         </w:rPr>
-        <w:t>.env</w:t>
-      </w:r>
+      </w:pPr>
+      <w:proofErr w:type="gramStart"/>
       <w:r>
         <w:rPr>
           <w:sz w:val="28"/>
           <w:szCs w:val="28"/>
           <w:lang w:val="en-US"/>
         </w:rPr>
-        <w:tab/>
-      </w:r>
-    </w:p>
-    <w:p>
-      <w:pPr>
-        <w:pStyle w:val="Sinespaciado"/>
+        <w:t>.env</w:t>
+      </w:r>
+      <w:proofErr w:type="gramEnd"/>
+      <w:r>
         <w:rPr>
           <w:sz w:val="28"/>
           <w:szCs w:val="28"/>
           <w:lang w:val="en-US"/>
         </w:rPr>
-      </w:pPr>
-      <w:r>
+        <w:tab/>
+      </w:r>
+    </w:p>
+    <w:p>
+      <w:pPr>
+        <w:pStyle w:val="Sinespaciado"/>
         <w:rPr>
           <w:sz w:val="28"/>
           <w:szCs w:val="28"/>
           <w:lang w:val="en-US"/>
         </w:rPr>
-        <w:tab/>
-      </w:r>
+      </w:pPr>
       <w:r>
         <w:rPr>
           <w:sz w:val="28"/>
@@ -2479,6 +2819,14 @@
         </w:rPr>
         <w:tab/>
       </w:r>
+      <w:r>
+        <w:rPr>
+          <w:sz w:val="28"/>
+          <w:szCs w:val="28"/>
+          <w:lang w:val="en-US"/>
+        </w:rPr>
+        <w:tab/>
+      </w:r>
     </w:p>
     <w:p>
       <w:pPr>
@@ -2517,11 +2865,12 @@
     <w:p>
       <w:pPr>
         <w:pStyle w:val="Ttulo2"/>
-        <w:rPr>
-          <w:lang w:val="en-US"/>
-        </w:rPr>
-      </w:pPr>
-      <w:bookmarkStart w:id="6" w:name="_Toc230527819"/>
+        <w:ind w:left="708" w:hanging="708"/>
+        <w:rPr>
+          <w:lang w:val="en-US"/>
+        </w:rPr>
+      </w:pPr>
+      <w:bookmarkStart w:id="6" w:name="_Toc230533612"/>
       <w:r>
         <w:rPr>
           <w:lang w:val="en-US"/>
@@ -2533,7 +2882,7 @@
         <w:rPr>
           <w:lang w:val="en-US"/>
         </w:rPr>
-        <w:t xml:space="preserve"> Cloude</w:t>
+        <w:t xml:space="preserve"> Cloud</w:t>
       </w:r>
       <w:bookmarkEnd w:id="6"/>
     </w:p>
@@ -2555,12 +2904,14 @@
         </w:rPr>
         <w:t>“</w:t>
       </w:r>
+      <w:proofErr w:type="spellStart"/>
       <w:r>
         <w:rPr>
           <w:lang w:val="en-US"/>
         </w:rPr>
         <w:t>PersonalProjects</w:t>
       </w:r>
+      <w:proofErr w:type="spellEnd"/>
       <w:r>
         <w:rPr>
           <w:lang w:val="en-US"/>
@@ -2632,7 +2983,21 @@
         <w:rPr>
           <w:lang w:val="en-US"/>
         </w:rPr>
-        <w:t>Created resource group rg-portfolio-prod</w:t>
+        <w:t xml:space="preserve">Created resource group </w:t>
+      </w:r>
+      <w:proofErr w:type="spellStart"/>
+      <w:r>
+        <w:rPr>
+          <w:lang w:val="en-US"/>
+        </w:rPr>
+        <w:t>rg</w:t>
+      </w:r>
+      <w:proofErr w:type="spellEnd"/>
+      <w:r>
+        <w:rPr>
+          <w:lang w:val="en-US"/>
+        </w:rPr>
+        <w:t>-portfolio-prod</w:t>
       </w:r>
       <w:r>
         <w:rPr>
@@ -2935,7 +3300,35 @@
         <w:rPr>
           <w:lang w:val="en-US"/>
         </w:rPr>
-        <w:t xml:space="preserve"> It currently contains an ngix placeholder while we configure our container.</w:t>
+        <w:t xml:space="preserve"> It currently contains </w:t>
+      </w:r>
+      <w:proofErr w:type="gramStart"/>
+      <w:r>
+        <w:rPr>
+          <w:lang w:val="en-US"/>
+        </w:rPr>
+        <w:t>an</w:t>
+      </w:r>
+      <w:proofErr w:type="gramEnd"/>
+      <w:r>
+        <w:rPr>
+          <w:lang w:val="en-US"/>
+        </w:rPr>
+        <w:t xml:space="preserve"> </w:t>
+      </w:r>
+      <w:proofErr w:type="spellStart"/>
+      <w:r>
+        <w:rPr>
+          <w:lang w:val="en-US"/>
+        </w:rPr>
+        <w:t>ngix</w:t>
+      </w:r>
+      <w:proofErr w:type="spellEnd"/>
+      <w:r>
+        <w:rPr>
+          <w:lang w:val="en-US"/>
+        </w:rPr>
+        <w:t xml:space="preserve"> placeholder while we configure our container.</w:t>
       </w:r>
     </w:p>
     <w:p>
@@ -3237,7 +3630,7 @@
           <w:lang w:val="en-US"/>
         </w:rPr>
       </w:pPr>
-      <w:bookmarkStart w:id="7" w:name="_Toc230527820"/>
+      <w:bookmarkStart w:id="7" w:name="_Toc230533613"/>
       <w:r>
         <w:rPr>
           <w:lang w:val="en-US"/>
@@ -3292,6 +3685,7 @@
       </w:pPr>
       <w:r>
         <w:rPr>
+          <w:noProof/>
           <w:lang w:val="en-US"/>
         </w:rPr>
         <w:drawing>
@@ -3465,7 +3859,21 @@
         <w:rPr>
           <w:lang w:val="en-US"/>
         </w:rPr>
-        <w:t xml:space="preserve"> static asset stored in the /dist directory.</w:t>
+        <w:t xml:space="preserve"> static asset stored in the /</w:t>
+      </w:r>
+      <w:proofErr w:type="spellStart"/>
+      <w:r>
+        <w:rPr>
+          <w:lang w:val="en-US"/>
+        </w:rPr>
+        <w:t>dist</w:t>
+      </w:r>
+      <w:proofErr w:type="spellEnd"/>
+      <w:r>
+        <w:rPr>
+          <w:lang w:val="en-US"/>
+        </w:rPr>
+        <w:t xml:space="preserve"> directory.</w:t>
       </w:r>
     </w:p>
     <w:p>
@@ -3486,7 +3894,21 @@
           <w:lang w:val="en-US"/>
         </w:rPr>
         <w:lastRenderedPageBreak/>
-        <w:t xml:space="preserve">The Deployment: Using Microsoft’s official Static Web Apps deployment action, the pipeline securely uploads the compiled /dist folder directly to Azure’s </w:t>
+        <w:t>The Deployment: Using Microsoft’s official Static Web Apps deployment action, the pipeline securely uploads the compiled /</w:t>
+      </w:r>
+      <w:proofErr w:type="spellStart"/>
+      <w:r>
+        <w:rPr>
+          <w:lang w:val="en-US"/>
+        </w:rPr>
+        <w:t>dist</w:t>
+      </w:r>
+      <w:proofErr w:type="spellEnd"/>
+      <w:r>
+        <w:rPr>
+          <w:lang w:val="en-US"/>
+        </w:rPr>
+        <w:t xml:space="preserve"> folder directly to Azure’s </w:t>
       </w:r>
       <w:r>
         <w:rPr>
@@ -3526,11 +3948,19 @@
         </w:rPr>
         <w:t>“</w:t>
       </w:r>
-      <w:r>
-        <w:rPr>
-          <w:lang w:val="en-US"/>
-        </w:rPr>
-        <w:t>skip_api_build: true</w:t>
+      <w:proofErr w:type="spellStart"/>
+      <w:r>
+        <w:rPr>
+          <w:lang w:val="en-US"/>
+        </w:rPr>
+        <w:t>skip_api_build</w:t>
+      </w:r>
+      <w:proofErr w:type="spellEnd"/>
+      <w:r>
+        <w:rPr>
+          <w:lang w:val="en-US"/>
+        </w:rPr>
+        <w:t>: true</w:t>
       </w:r>
       <w:r>
         <w:rPr>

</xml_diff>